<commit_message>
Fixed burnt out typist display spacing in TypingRace
</commit_message>
<xml_diff>
--- a/Part1/Typist Class Report OOP.docx
+++ b/Part1/Typist Class Report OOP.docx
@@ -23,19 +23,75 @@
           <w:u w:val="single"/>
           <w:lang w:val="en-US"/>
         </w:rPr>
-        <w:t>Typist Class Report OOP</w:t>
-      </w:r>
-    </w:p>
-    <w:p>
-      <w:pPr>
-        <w:rPr>
+        <w:t>Typi</w:t>
+      </w:r>
+      <w:r>
+        <w:rPr>
+          <w:b/>
+          <w:bCs/>
+          <w:sz w:val="36"/>
+          <w:szCs w:val="36"/>
+          <w:u w:val="single"/>
           <w:lang w:val="en-US"/>
         </w:rPr>
-      </w:pPr>
-      <w:r>
-        <w:rPr>
+        <w:t>ng Simulator</w:t>
+      </w:r>
+      <w:r>
+        <w:rPr>
+          <w:b/>
+          <w:bCs/>
+          <w:sz w:val="36"/>
+          <w:szCs w:val="36"/>
+          <w:u w:val="single"/>
           <w:lang w:val="en-US"/>
         </w:rPr>
+        <w:t xml:space="preserve"> Report OOP</w:t>
+      </w:r>
+    </w:p>
+    <w:p>
+      <w:pPr>
+        <w:rPr>
+          <w:b/>
+          <w:bCs/>
+          <w:sz w:val="28"/>
+          <w:szCs w:val="28"/>
+          <w:u w:val="single"/>
+          <w:lang w:val="en-US"/>
+        </w:rPr>
+      </w:pPr>
+      <w:r>
+        <w:rPr>
+          <w:b/>
+          <w:bCs/>
+          <w:sz w:val="28"/>
+          <w:szCs w:val="28"/>
+          <w:u w:val="single"/>
+          <w:lang w:val="en-US"/>
+        </w:rPr>
+        <w:t xml:space="preserve">Typist </w:t>
+      </w:r>
+      <w:r>
+        <w:rPr>
+          <w:b/>
+          <w:bCs/>
+          <w:sz w:val="28"/>
+          <w:szCs w:val="28"/>
+          <w:u w:val="single"/>
+          <w:lang w:val="en-US"/>
+        </w:rPr>
+        <w:t>Class</w:t>
+      </w:r>
+    </w:p>
+    <w:p>
+      <w:pPr>
+        <w:rPr>
+          <w:lang w:val="en-US"/>
+        </w:rPr>
+      </w:pPr>
+      <w:r>
+        <w:rPr>
+          <w:lang w:val="en-US"/>
+        </w:rPr>
         <w:t>Encapsulation is where you hide the implementation of the code as much as possible, so there’s restrictions to accessing those fields, e.g. all the fields declared in the class Typist are private</w:t>
       </w:r>
       <w:r>
@@ -60,12 +116,26 @@
         <w:rPr>
           <w:lang w:val="en-US"/>
         </w:rPr>
-        <w:t xml:space="preserve">, which means other classes cannot change the game values directly (accuracy, progress, burnoutTurnsRemaining). This makes sure </w:t>
-      </w:r>
+        <w:t xml:space="preserve">, which means other classes cannot change the game values directly (accuracy, progress, </w:t>
+      </w:r>
+      <w:proofErr w:type="spellStart"/>
       <w:r>
         <w:rPr>
           <w:lang w:val="en-US"/>
         </w:rPr>
+        <w:t>burnoutTurnsRemaining</w:t>
+      </w:r>
+      <w:proofErr w:type="spellEnd"/>
+      <w:r>
+        <w:rPr>
+          <w:lang w:val="en-US"/>
+        </w:rPr>
+        <w:t xml:space="preserve">). This makes sure </w:t>
+      </w:r>
+      <w:r>
+        <w:rPr>
+          <w:lang w:val="en-US"/>
+        </w:rPr>
         <w:t>the object can’t enter any invalid states such as progress going below zero, or accuracy outside the range of 0 to 1.</w:t>
       </w:r>
       <w:r>
@@ -179,38 +249,80 @@
         </w:rPr>
         <w:t xml:space="preserve"> </w:t>
       </w:r>
-      <w:r>
-        <w:t>getName()</w:t>
+      <w:proofErr w:type="spellStart"/>
+      <w:r>
+        <w:t>getName</w:t>
+      </w:r>
+      <w:proofErr w:type="spellEnd"/>
+      <w:r>
+        <w:t>()</w:t>
       </w:r>
       <w:r>
         <w:t xml:space="preserve">, </w:t>
       </w:r>
-      <w:r>
-        <w:t>getSymbol()</w:t>
+      <w:proofErr w:type="spellStart"/>
+      <w:r>
+        <w:t>getSymbol</w:t>
+      </w:r>
+      <w:proofErr w:type="spellEnd"/>
+      <w:r>
+        <w:t>()</w:t>
       </w:r>
       <w:r>
         <w:t>,</w:t>
       </w:r>
       <w:r>
-        <w:t xml:space="preserve"> getProgress()</w:t>
+        <w:t xml:space="preserve"> </w:t>
+      </w:r>
+      <w:proofErr w:type="spellStart"/>
+      <w:r>
+        <w:t>getProgress</w:t>
+      </w:r>
+      <w:proofErr w:type="spellEnd"/>
+      <w:r>
+        <w:t>()</w:t>
       </w:r>
       <w:r>
         <w:t>,</w:t>
       </w:r>
       <w:r>
-        <w:t xml:space="preserve"> getAccuracy()</w:t>
+        <w:t xml:space="preserve"> </w:t>
+      </w:r>
+      <w:proofErr w:type="spellStart"/>
+      <w:r>
+        <w:t>getAccuracy</w:t>
+      </w:r>
+      <w:proofErr w:type="spellEnd"/>
+      <w:r>
+        <w:t>()</w:t>
       </w:r>
       <w:r>
         <w:t>,</w:t>
       </w:r>
       <w:r>
-        <w:t xml:space="preserve"> getBurnoutTurnsRemaining()</w:t>
+        <w:t xml:space="preserve"> </w:t>
+      </w:r>
+      <w:proofErr w:type="spellStart"/>
+      <w:r>
+        <w:t>getBurnoutTurnsRemaining</w:t>
+      </w:r>
+      <w:proofErr w:type="spellEnd"/>
+      <w:r>
+        <w:t>()</w:t>
       </w:r>
       <w:r>
         <w:t>,</w:t>
       </w:r>
       <w:r>
-        <w:t xml:space="preserve"> isBurntOut()</w:t>
+        <w:t xml:space="preserve"> </w:t>
+      </w:r>
+      <w:proofErr w:type="spellStart"/>
+      <w:r>
+        <w:t>isBurntOut</w:t>
+      </w:r>
+      <w:proofErr w:type="spellEnd"/>
+      <w:r>
+        <w:t>()</w:t>
       </w:r>
       <w:r>
         <w:t>.</w:t>
@@ -245,44 +357,110 @@
       <w:r>
         <w:t xml:space="preserve">Typist class are: </w:t>
       </w:r>
-      <w:r>
-        <w:t>setSymbol(char newSymbol)</w:t>
+      <w:proofErr w:type="spellStart"/>
+      <w:r>
+        <w:t>setSymbol</w:t>
+      </w:r>
+      <w:proofErr w:type="spellEnd"/>
+      <w:r>
+        <w:t xml:space="preserve">(char </w:t>
+      </w:r>
+      <w:proofErr w:type="spellStart"/>
+      <w:r>
+        <w:t>newSymbol</w:t>
+      </w:r>
+      <w:proofErr w:type="spellEnd"/>
+      <w:r>
+        <w:t>)</w:t>
       </w:r>
       <w:r>
         <w:t xml:space="preserve">, </w:t>
       </w:r>
-      <w:r>
-        <w:t>setAccuracy(double newAccuracy)</w:t>
+      <w:proofErr w:type="spellStart"/>
+      <w:r>
+        <w:t>setAccuracy</w:t>
+      </w:r>
+      <w:proofErr w:type="spellEnd"/>
+      <w:r>
+        <w:t xml:space="preserve">(double </w:t>
+      </w:r>
+      <w:proofErr w:type="spellStart"/>
+      <w:r>
+        <w:t>newAccuracy</w:t>
+      </w:r>
+      <w:proofErr w:type="spellEnd"/>
+      <w:r>
+        <w:t>)</w:t>
       </w:r>
       <w:r>
         <w:t>,</w:t>
       </w:r>
       <w:r>
-        <w:t xml:space="preserve"> typeCharacter()</w:t>
+        <w:t xml:space="preserve"> </w:t>
+      </w:r>
+      <w:proofErr w:type="spellStart"/>
+      <w:r>
+        <w:t>typeCharacter</w:t>
+      </w:r>
+      <w:proofErr w:type="spellEnd"/>
+      <w:r>
+        <w:t>()</w:t>
       </w:r>
       <w:r>
         <w:t>,</w:t>
       </w:r>
       <w:r>
-        <w:t xml:space="preserve"> slideBack(int amount)</w:t>
+        <w:t xml:space="preserve"> </w:t>
+      </w:r>
+      <w:proofErr w:type="spellStart"/>
+      <w:r>
+        <w:t>slideBack</w:t>
+      </w:r>
+      <w:proofErr w:type="spellEnd"/>
+      <w:r>
+        <w:t>(int amount)</w:t>
       </w:r>
       <w:r>
         <w:t>,</w:t>
       </w:r>
       <w:r>
-        <w:t xml:space="preserve"> burnOut(int turns)</w:t>
+        <w:t xml:space="preserve"> </w:t>
+      </w:r>
+      <w:proofErr w:type="spellStart"/>
+      <w:r>
+        <w:t>burnOut</w:t>
+      </w:r>
+      <w:proofErr w:type="spellEnd"/>
+      <w:r>
+        <w:t>(int turns)</w:t>
       </w:r>
       <w:r>
         <w:t>,</w:t>
       </w:r>
       <w:r>
-        <w:t xml:space="preserve"> recoverFromBurnout()</w:t>
+        <w:t xml:space="preserve"> </w:t>
+      </w:r>
+      <w:proofErr w:type="spellStart"/>
+      <w:r>
+        <w:t>recoverFromBurnout</w:t>
+      </w:r>
+      <w:proofErr w:type="spellEnd"/>
+      <w:r>
+        <w:t>()</w:t>
       </w:r>
       <w:r>
         <w:t>,</w:t>
       </w:r>
       <w:r>
-        <w:t xml:space="preserve"> resetToStart()</w:t>
+        <w:t xml:space="preserve"> </w:t>
+      </w:r>
+      <w:proofErr w:type="spellStart"/>
+      <w:r>
+        <w:t>resetToStart</w:t>
+      </w:r>
+      <w:proofErr w:type="spellEnd"/>
+      <w:r>
+        <w:t>()</w:t>
       </w:r>
       <w:r>
         <w:t>.</w:t>
@@ -291,7 +469,15 @@
     <w:p/>
     <w:p>
       <w:r>
-        <w:t xml:space="preserve">The slideBack() method </w:t>
+        <w:t xml:space="preserve">The </w:t>
+      </w:r>
+      <w:proofErr w:type="spellStart"/>
+      <w:r>
+        <w:t>slideBack</w:t>
+      </w:r>
+      <w:proofErr w:type="spellEnd"/>
+      <w:r>
+        <w:t xml:space="preserve">() method </w:t>
       </w:r>
       <w:r>
         <w:t>reverses the typist’s progress if they make a mistake.</w:t>
@@ -324,7 +510,15 @@
     <w:p/>
     <w:p>
       <w:r>
-        <w:t>The setAccuracy() method modifies the typist’s accuracy rating</w:t>
+        <w:t xml:space="preserve">The </w:t>
+      </w:r>
+      <w:proofErr w:type="spellStart"/>
+      <w:r>
+        <w:t>setAccuracy</w:t>
+      </w:r>
+      <w:proofErr w:type="spellEnd"/>
+      <w:r>
+        <w:t>() method modifies the typist’s accuracy rating</w:t>
       </w:r>
       <w:r>
         <w:t>, ensuring it stays between the range of 0</w:t>
@@ -371,6 +565,9 @@
     </w:p>
     <w:p>
       <w:r>
+        <w:rPr>
+          <w:noProof/>
+        </w:rPr>
         <w:lastRenderedPageBreak/>
         <w:drawing>
           <wp:inline distT="0" distB="0" distL="0" distR="0" wp14:anchorId="5EEE77D8" wp14:editId="0B6D0929">
@@ -472,11 +669,19 @@
           <w:u w:val="single"/>
         </w:rPr>
       </w:pPr>
-      <w:r>
-        <w:rPr>
-          <w:u w:val="single"/>
-        </w:rPr>
-        <w:t>typeCharacter() Test</w:t>
+      <w:proofErr w:type="spellStart"/>
+      <w:r>
+        <w:rPr>
+          <w:u w:val="single"/>
+        </w:rPr>
+        <w:t>typeCharacter</w:t>
+      </w:r>
+      <w:proofErr w:type="spellEnd"/>
+      <w:r>
+        <w:rPr>
+          <w:u w:val="single"/>
+        </w:rPr>
+        <w:t>() Test</w:t>
       </w:r>
       <w:r>
         <w:rPr>
@@ -489,8 +694,13 @@
       <w:r>
         <w:t xml:space="preserve">I called </w:t>
       </w:r>
-      <w:r>
-        <w:t xml:space="preserve">typeCharacter() for the object of class Typist called test 3 times, so </w:t>
+      <w:proofErr w:type="spellStart"/>
+      <w:r>
+        <w:t>typeCharacter</w:t>
+      </w:r>
+      <w:proofErr w:type="spellEnd"/>
+      <w:r>
+        <w:t xml:space="preserve">() for the object of class Typist called test 3 times, so </w:t>
       </w:r>
       <w:r>
         <w:t xml:space="preserve">I printed a line that said </w:t>
@@ -508,20 +718,36 @@
         <w:t xml:space="preserve"> </w:t>
       </w:r>
       <w:r>
-        <w:t>The test also confirmed the progress was 3 so typeCharacter() moves forward normally.</w:t>
-      </w:r>
-    </w:p>
-    <w:p>
-      <w:pPr>
-        <w:rPr>
-          <w:u w:val="single"/>
-        </w:rPr>
-      </w:pPr>
-      <w:r>
-        <w:rPr>
-          <w:u w:val="single"/>
-        </w:rPr>
-        <w:t>slideBack() Test</w:t>
+        <w:t xml:space="preserve">The test also confirmed the progress was 3 so </w:t>
+      </w:r>
+      <w:proofErr w:type="spellStart"/>
+      <w:r>
+        <w:t>typeCharacter</w:t>
+      </w:r>
+      <w:proofErr w:type="spellEnd"/>
+      <w:r>
+        <w:t>() moves forward normally.</w:t>
+      </w:r>
+    </w:p>
+    <w:p>
+      <w:pPr>
+        <w:rPr>
+          <w:u w:val="single"/>
+        </w:rPr>
+      </w:pPr>
+      <w:proofErr w:type="spellStart"/>
+      <w:r>
+        <w:rPr>
+          <w:u w:val="single"/>
+        </w:rPr>
+        <w:t>slideBack</w:t>
+      </w:r>
+      <w:proofErr w:type="spellEnd"/>
+      <w:r>
+        <w:rPr>
+          <w:u w:val="single"/>
+        </w:rPr>
+        <w:t>() Test</w:t>
       </w:r>
       <w:r>
         <w:rPr>
@@ -534,9 +760,11 @@
       <w:r>
         <w:t xml:space="preserve">I called </w:t>
       </w:r>
+      <w:proofErr w:type="spellStart"/>
       <w:r>
         <w:t>slideBack</w:t>
       </w:r>
+      <w:proofErr w:type="spellEnd"/>
       <w:r>
         <w:t xml:space="preserve">() for the </w:t>
       </w:r>
@@ -571,7 +799,15 @@
         <w:t>)</w:t>
       </w:r>
       <w:r>
-        <w:t>, confirming the progress can’t go below zero after calling slideBack().</w:t>
+        <w:t xml:space="preserve">, confirming the progress can’t go below zero after calling </w:t>
+      </w:r>
+      <w:proofErr w:type="spellStart"/>
+      <w:r>
+        <w:t>slideBack</w:t>
+      </w:r>
+      <w:proofErr w:type="spellEnd"/>
+      <w:r>
+        <w:t>().</w:t>
       </w:r>
     </w:p>
     <w:p>
@@ -615,9 +851,11 @@
       <w:r>
         <w:t xml:space="preserve">I called </w:t>
       </w:r>
+      <w:proofErr w:type="spellStart"/>
       <w:r>
         <w:t>burnOut</w:t>
       </w:r>
+      <w:proofErr w:type="spellEnd"/>
       <w:r>
         <w:t xml:space="preserve">() for the </w:t>
       </w:r>
@@ -628,71 +866,199 @@
         <w:t>object of class Typist called test</w:t>
       </w:r>
       <w:r>
-        <w:t xml:space="preserve">, with the parameter of the integer </w:t>
-      </w:r>
-      <w:r>
-        <w:t>3</w:t>
+        <w:t>, with the parameter of the integer 3 for the turns.</w:t>
+      </w:r>
+      <w:r>
+        <w:t xml:space="preserve"> The expected behaviour was that the Boolean </w:t>
+      </w:r>
+      <w:proofErr w:type="spellStart"/>
+      <w:r>
+        <w:t>burntOut</w:t>
+      </w:r>
+      <w:proofErr w:type="spellEnd"/>
+      <w:r>
+        <w:t xml:space="preserve"> should be assigned the value of true and the </w:t>
+      </w:r>
+      <w:proofErr w:type="spellStart"/>
+      <w:r>
+        <w:t>burnoutTurnsRemaining</w:t>
+      </w:r>
+      <w:proofErr w:type="spellEnd"/>
+      <w:r>
+        <w:t xml:space="preserve"> should be equal to the parameter turns inputted.</w:t>
+      </w:r>
+      <w:r>
+        <w:t xml:space="preserve"> </w:t>
+      </w:r>
+      <w:r>
+        <w:t xml:space="preserve">The </w:t>
+      </w:r>
+      <w:r>
+        <w:t xml:space="preserve">burnout Boolean was outputted as true and the </w:t>
+      </w:r>
+      <w:proofErr w:type="spellStart"/>
+      <w:r>
+        <w:t>burnoutTurnsRemaining</w:t>
+      </w:r>
+      <w:proofErr w:type="spellEnd"/>
+      <w:r>
+        <w:t xml:space="preserve"> mirrored the integer inputted, matching expectations. </w:t>
+      </w:r>
+    </w:p>
+    <w:p>
+      <w:pPr>
+        <w:rPr>
+          <w:u w:val="single"/>
+        </w:rPr>
+      </w:pPr>
+      <w:proofErr w:type="spellStart"/>
+      <w:r>
+        <w:rPr>
+          <w:u w:val="single"/>
+        </w:rPr>
+        <w:t>set</w:t>
+      </w:r>
+      <w:r>
+        <w:rPr>
+          <w:u w:val="single"/>
+        </w:rPr>
+        <w:t>Accuracy</w:t>
+      </w:r>
+      <w:proofErr w:type="spellEnd"/>
+      <w:r>
+        <w:rPr>
+          <w:u w:val="single"/>
+        </w:rPr>
+        <w:t>()</w:t>
+      </w:r>
+      <w:r>
+        <w:rPr>
+          <w:u w:val="single"/>
+        </w:rPr>
+        <w:t xml:space="preserve"> T</w:t>
+      </w:r>
+      <w:r>
+        <w:rPr>
+          <w:u w:val="single"/>
+        </w:rPr>
+        <w:t>est:</w:t>
+      </w:r>
+    </w:p>
+    <w:p>
+      <w:pPr>
+        <w:rPr>
+          <w:u w:val="single"/>
+        </w:rPr>
+      </w:pPr>
+      <w:r>
+        <w:t xml:space="preserve">I called </w:t>
+      </w:r>
+      <w:proofErr w:type="spellStart"/>
+      <w:r>
+        <w:t>setAccuracy</w:t>
+      </w:r>
+      <w:proofErr w:type="spellEnd"/>
+      <w:r>
+        <w:t xml:space="preserve">() for the </w:t>
+      </w:r>
+      <w:r>
+        <w:t xml:space="preserve">same </w:t>
+      </w:r>
+      <w:r>
+        <w:t>object of class Typist called test</w:t>
+      </w:r>
+      <w:r>
+        <w:t>, with the parameter of the double</w:t>
+      </w:r>
+      <w:r>
+        <w:t>s</w:t>
+      </w:r>
+      <w:r>
+        <w:t xml:space="preserve"> </w:t>
+      </w:r>
+      <w:r>
+        <w:t>1.2, -0.7 and 0.5</w:t>
       </w:r>
       <w:r>
         <w:t xml:space="preserve"> for the </w:t>
       </w:r>
       <w:r>
-        <w:t>turns.</w:t>
-      </w:r>
-      <w:r>
-        <w:t xml:space="preserve"> The expected behaviour was that the Boolean burntOut should be assigned the value of true and the burnoutTurnsRemaining should be equal to the parameter turns inputted.</w:t>
-      </w:r>
-      <w:r>
-        <w:t xml:space="preserve"> </w:t>
-      </w:r>
-      <w:r>
-        <w:t xml:space="preserve">The </w:t>
-      </w:r>
-      <w:r>
-        <w:t xml:space="preserve">burnout Boolean was outputted as true and the </w:t>
-      </w:r>
-      <w:r>
-        <w:t>burnoutTurnsRemaining</w:t>
-      </w:r>
-      <w:r>
-        <w:t xml:space="preserve"> mirrored the integer inputted, matching expectations. </w:t>
-      </w:r>
-    </w:p>
-    <w:p>
-      <w:pPr>
-        <w:rPr>
-          <w:u w:val="single"/>
-        </w:rPr>
-      </w:pPr>
-      <w:r>
-        <w:rPr>
-          <w:u w:val="single"/>
-        </w:rPr>
-        <w:t>set</w:t>
-      </w:r>
-      <w:r>
-        <w:rPr>
-          <w:u w:val="single"/>
-        </w:rPr>
-        <w:t>Accuracy</w:t>
-      </w:r>
-      <w:r>
-        <w:rPr>
-          <w:u w:val="single"/>
-        </w:rPr>
-        <w:t>()</w:t>
-      </w:r>
-      <w:r>
-        <w:rPr>
-          <w:u w:val="single"/>
-        </w:rPr>
-        <w:t xml:space="preserve"> T</w:t>
-      </w:r>
-      <w:r>
-        <w:rPr>
-          <w:u w:val="single"/>
-        </w:rPr>
-        <w:t>est:</w:t>
+        <w:t xml:space="preserve">accuracy rating. </w:t>
+      </w:r>
+      <w:r>
+        <w:t xml:space="preserve">The expected results </w:t>
+      </w:r>
+      <w:r>
+        <w:t>were that</w:t>
+      </w:r>
+      <w:r>
+        <w:t xml:space="preserve"> the accuracy rating stays between the range of 0.0 and 1.0. If the </w:t>
+      </w:r>
+      <w:r>
+        <w:t>accuracy rating</w:t>
+      </w:r>
+      <w:r>
+        <w:t xml:space="preserve"> is below zero</w:t>
+      </w:r>
+      <w:r>
+        <w:t xml:space="preserve"> (-0.7)</w:t>
+      </w:r>
+      <w:r>
+        <w:t xml:space="preserve">, </w:t>
+      </w:r>
+      <w:r>
+        <w:t xml:space="preserve">it </w:t>
+      </w:r>
+      <w:r>
+        <w:t xml:space="preserve">is set to zero. </w:t>
+      </w:r>
+      <w:r>
+        <w:t>If</w:t>
+      </w:r>
+      <w:r>
+        <w:t xml:space="preserve"> it’s above one</w:t>
+      </w:r>
+      <w:r>
+        <w:t xml:space="preserve"> (1.2)</w:t>
+      </w:r>
+      <w:r>
+        <w:t>, the accuracy rating is set to one. Valid values</w:t>
+      </w:r>
+      <w:r>
+        <w:t xml:space="preserve"> (0.5)</w:t>
+      </w:r>
+      <w:r>
+        <w:t xml:space="preserve"> are </w:t>
+      </w:r>
+      <w:r>
+        <w:t>unchanged.</w:t>
+      </w:r>
+    </w:p>
+    <w:p>
+      <w:pPr>
+        <w:rPr>
+          <w:u w:val="single"/>
+        </w:rPr>
+      </w:pPr>
+      <w:proofErr w:type="spellStart"/>
+      <w:r>
+        <w:rPr>
+          <w:u w:val="single"/>
+        </w:rPr>
+        <w:t>resetToStart</w:t>
+      </w:r>
+      <w:proofErr w:type="spellEnd"/>
+      <w:r>
+        <w:rPr>
+          <w:u w:val="single"/>
+        </w:rPr>
+        <w:t>() Test</w:t>
+      </w:r>
+      <w:r>
+        <w:rPr>
+          <w:u w:val="single"/>
+        </w:rPr>
+        <w:t>:</w:t>
       </w:r>
     </w:p>
     <w:p>
@@ -704,9 +1070,11 @@
       <w:r>
         <w:t xml:space="preserve">I called </w:t>
       </w:r>
-      <w:r>
-        <w:t>setAccuracy</w:t>
-      </w:r>
+      <w:proofErr w:type="spellStart"/>
+      <w:r>
+        <w:t>resetToStart</w:t>
+      </w:r>
+      <w:proofErr w:type="spellEnd"/>
       <w:r>
         <w:t xml:space="preserve">() for the </w:t>
       </w:r>
@@ -717,119 +1085,6 @@
         <w:t>object of class Typist called test</w:t>
       </w:r>
       <w:r>
-        <w:t xml:space="preserve">, with the parameter of the </w:t>
-      </w:r>
-      <w:r>
-        <w:t>double</w:t>
-      </w:r>
-      <w:r>
-        <w:t>s</w:t>
-      </w:r>
-      <w:r>
-        <w:t xml:space="preserve"> </w:t>
-      </w:r>
-      <w:r>
-        <w:t>1.2, -0.7 and 0.5</w:t>
-      </w:r>
-      <w:r>
-        <w:t xml:space="preserve"> for the </w:t>
-      </w:r>
-      <w:r>
-        <w:t xml:space="preserve">accuracy rating. </w:t>
-      </w:r>
-      <w:r>
-        <w:t xml:space="preserve">The expected results </w:t>
-      </w:r>
-      <w:r>
-        <w:t>were that</w:t>
-      </w:r>
-      <w:r>
-        <w:t xml:space="preserve"> the accuracy rating </w:t>
-      </w:r>
-      <w:r>
-        <w:t xml:space="preserve">stays between the range of 0.0 and 1.0. If the </w:t>
-      </w:r>
-      <w:r>
-        <w:t>accuracy rating</w:t>
-      </w:r>
-      <w:r>
-        <w:t xml:space="preserve"> is below zero</w:t>
-      </w:r>
-      <w:r>
-        <w:t xml:space="preserve"> (-0.7)</w:t>
-      </w:r>
-      <w:r>
-        <w:t xml:space="preserve">, </w:t>
-      </w:r>
-      <w:r>
-        <w:t xml:space="preserve">it </w:t>
-      </w:r>
-      <w:r>
-        <w:t xml:space="preserve">is set to zero. </w:t>
-      </w:r>
-      <w:r>
-        <w:t>If</w:t>
-      </w:r>
-      <w:r>
-        <w:t xml:space="preserve"> it’s above one</w:t>
-      </w:r>
-      <w:r>
-        <w:t xml:space="preserve"> (1.2)</w:t>
-      </w:r>
-      <w:r>
-        <w:t>, the accuracy rating is set to one. Valid values</w:t>
-      </w:r>
-      <w:r>
-        <w:t xml:space="preserve"> (0.5)</w:t>
-      </w:r>
-      <w:r>
-        <w:t xml:space="preserve"> are </w:t>
-      </w:r>
-      <w:r>
-        <w:t>unchanged.</w:t>
-      </w:r>
-    </w:p>
-    <w:p>
-      <w:pPr>
-        <w:rPr>
-          <w:u w:val="single"/>
-        </w:rPr>
-      </w:pPr>
-      <w:r>
-        <w:rPr>
-          <w:u w:val="single"/>
-        </w:rPr>
-        <w:t>resetToStart() Test</w:t>
-      </w:r>
-      <w:r>
-        <w:rPr>
-          <w:u w:val="single"/>
-        </w:rPr>
-        <w:t>:</w:t>
-      </w:r>
-    </w:p>
-    <w:p>
-      <w:pPr>
-        <w:rPr>
-          <w:u w:val="single"/>
-        </w:rPr>
-      </w:pPr>
-      <w:r>
-        <w:t xml:space="preserve">I called </w:t>
-      </w:r>
-      <w:r>
-        <w:t>resetToStart</w:t>
-      </w:r>
-      <w:r>
-        <w:t xml:space="preserve">() for the </w:t>
-      </w:r>
-      <w:r>
-        <w:t xml:space="preserve">same </w:t>
-      </w:r>
-      <w:r>
-        <w:t>object of class Typist called test</w:t>
-      </w:r>
-      <w:r>
         <w:t xml:space="preserve">. </w:t>
       </w:r>
       <w:r>
@@ -884,8 +1139,13 @@
         <w:t xml:space="preserve"> the </w:t>
       </w:r>
       <w:r>
-        <w:t>Boolean isBurntOut</w:t>
-      </w:r>
+        <w:t xml:space="preserve">Boolean </w:t>
+      </w:r>
+      <w:proofErr w:type="spellStart"/>
+      <w:r>
+        <w:t>isBurntOut</w:t>
+      </w:r>
+      <w:proofErr w:type="spellEnd"/>
       <w:r>
         <w:t xml:space="preserve"> return</w:t>
       </w:r>
@@ -922,6 +1182,409 @@
           <w:u w:val="single"/>
         </w:rPr>
       </w:pPr>
+    </w:p>
+    <w:p>
+      <w:pPr>
+        <w:rPr>
+          <w:b/>
+          <w:bCs/>
+          <w:u w:val="single"/>
+        </w:rPr>
+      </w:pPr>
+    </w:p>
+    <w:p>
+      <w:pPr>
+        <w:rPr>
+          <w:b/>
+          <w:bCs/>
+          <w:sz w:val="28"/>
+          <w:szCs w:val="28"/>
+          <w:u w:val="single"/>
+        </w:rPr>
+      </w:pPr>
+      <w:proofErr w:type="spellStart"/>
+      <w:r>
+        <w:rPr>
+          <w:b/>
+          <w:bCs/>
+          <w:sz w:val="28"/>
+          <w:szCs w:val="28"/>
+          <w:u w:val="single"/>
+        </w:rPr>
+        <w:t>TypingRace</w:t>
+      </w:r>
+      <w:proofErr w:type="spellEnd"/>
+      <w:r>
+        <w:rPr>
+          <w:b/>
+          <w:bCs/>
+          <w:sz w:val="28"/>
+          <w:szCs w:val="28"/>
+          <w:u w:val="single"/>
+        </w:rPr>
+        <w:t xml:space="preserve"> Class Report:</w:t>
+      </w:r>
+    </w:p>
+    <w:p>
+      <w:r>
+        <w:t>After</w:t>
+      </w:r>
+      <w:r>
+        <w:t xml:space="preserve"> look</w:t>
+      </w:r>
+      <w:r>
+        <w:t>ing</w:t>
+      </w:r>
+      <w:r>
+        <w:t xml:space="preserve"> through the original </w:t>
+      </w:r>
+      <w:proofErr w:type="spellStart"/>
+      <w:r>
+        <w:t>TypingRace</w:t>
+      </w:r>
+      <w:proofErr w:type="spellEnd"/>
+      <w:r>
+        <w:t xml:space="preserve"> code</w:t>
+      </w:r>
+      <w:r>
+        <w:t>, I</w:t>
+      </w:r>
+      <w:r>
+        <w:t xml:space="preserve"> found </w:t>
+      </w:r>
+      <w:r>
+        <w:t>7</w:t>
+      </w:r>
+      <w:r>
+        <w:t xml:space="preserve"> issues.</w:t>
+      </w:r>
+      <w:r>
+        <w:t xml:space="preserve"> These were all major issues that didn’t allow the race to work correctly.</w:t>
+      </w:r>
+      <w:r>
+        <w:t xml:space="preserve"> I fixed these </w:t>
+      </w:r>
+      <w:r>
+        <w:t>one by one to make sure the race runs correctly.</w:t>
+      </w:r>
+    </w:p>
+    <w:p/>
+    <w:p>
+      <w:r>
+        <w:t xml:space="preserve">The first </w:t>
+      </w:r>
+      <w:r>
+        <w:t xml:space="preserve">issue was that not all typists were being reset at the start of the race. The original code reset seat1Typist and seat2Typist, but not seat3Typist. This </w:t>
+      </w:r>
+      <w:r>
+        <w:t>m</w:t>
+      </w:r>
+      <w:r>
+        <w:t>ade</w:t>
+      </w:r>
+      <w:r>
+        <w:t xml:space="preserve"> it </w:t>
+      </w:r>
+      <w:r>
+        <w:t>unfair because the third typist might</w:t>
+      </w:r>
+      <w:r>
+        <w:t xml:space="preserve"> ha</w:t>
+      </w:r>
+      <w:r>
+        <w:t xml:space="preserve">ve had </w:t>
+      </w:r>
+      <w:r>
+        <w:t xml:space="preserve">leftover progress or burnout from a previous race. I fixed this in </w:t>
+      </w:r>
+      <w:proofErr w:type="spellStart"/>
+      <w:r>
+        <w:t>startRace</w:t>
+      </w:r>
+      <w:proofErr w:type="spellEnd"/>
+      <w:r>
+        <w:t xml:space="preserve">() by calling </w:t>
+      </w:r>
+      <w:proofErr w:type="spellStart"/>
+      <w:r>
+        <w:t>resetToStart</w:t>
+      </w:r>
+      <w:proofErr w:type="spellEnd"/>
+      <w:r>
+        <w:t xml:space="preserve">() for </w:t>
+      </w:r>
+      <w:r>
+        <w:t>s</w:t>
+      </w:r>
+      <w:r>
+        <w:t>eat3Typis</w:t>
+      </w:r>
+      <w:r>
+        <w:t>t too</w:t>
+      </w:r>
+      <w:r>
+        <w:t>. The correct implementation should make sure every typist starts from the same initial state.</w:t>
+      </w:r>
+    </w:p>
+    <w:p>
+      <w:r>
+        <w:t xml:space="preserve">Code: </w:t>
+      </w:r>
+      <w:r>
+        <w:t>seat3Typist.resetToStart();</w:t>
+      </w:r>
+    </w:p>
+    <w:p/>
+    <w:p/>
+    <w:p>
+      <w:r>
+        <w:lastRenderedPageBreak/>
+        <w:t>The second</w:t>
+      </w:r>
+      <w:r>
+        <w:t xml:space="preserve"> issue was that there were no null checks for typists. </w:t>
+      </w:r>
+      <w:r>
+        <w:t>In t</w:t>
+      </w:r>
+      <w:r>
+        <w:t>he original code</w:t>
+      </w:r>
+      <w:r>
+        <w:t>, it was</w:t>
+      </w:r>
+      <w:r>
+        <w:t xml:space="preserve"> assumed all three seats always had a typist. If a seat was empty, this could cause a </w:t>
+      </w:r>
+      <w:proofErr w:type="spellStart"/>
+      <w:r>
+        <w:t>NullPointerException</w:t>
+      </w:r>
+      <w:proofErr w:type="spellEnd"/>
+      <w:r>
+        <w:t xml:space="preserve"> crash when methods like </w:t>
+      </w:r>
+      <w:proofErr w:type="spellStart"/>
+      <w:r>
+        <w:t>resetToStart</w:t>
+      </w:r>
+      <w:proofErr w:type="spellEnd"/>
+      <w:r>
+        <w:t xml:space="preserve">(), </w:t>
+      </w:r>
+      <w:proofErr w:type="spellStart"/>
+      <w:r>
+        <w:t>advanceTypist</w:t>
+      </w:r>
+      <w:proofErr w:type="spellEnd"/>
+      <w:r>
+        <w:t xml:space="preserve">(), </w:t>
+      </w:r>
+      <w:proofErr w:type="spellStart"/>
+      <w:r>
+        <w:t>raceFinishedBy</w:t>
+      </w:r>
+      <w:proofErr w:type="spellEnd"/>
+      <w:r>
+        <w:t xml:space="preserve">(), or </w:t>
+      </w:r>
+      <w:proofErr w:type="spellStart"/>
+      <w:r>
+        <w:t>printSeat</w:t>
+      </w:r>
+      <w:proofErr w:type="spellEnd"/>
+      <w:r>
+        <w:t>() were called. I fixed this by checking whether the typist is null before using it. The correct implementation should ignore empty seats instead of crashing.</w:t>
+      </w:r>
+    </w:p>
+    <w:p>
+      <w:r>
+        <w:t xml:space="preserve">Code: </w:t>
+      </w:r>
+      <w:r>
+        <w:t>if (seat1Typist != null) {</w:t>
+      </w:r>
+    </w:p>
+    <w:p>
+      <w:r>
+        <w:t>            seat1Typist.resetToStart();</w:t>
+      </w:r>
+    </w:p>
+    <w:p>
+      <w:r>
+        <w:t>        }</w:t>
+      </w:r>
+    </w:p>
+    <w:p>
+      <w:r>
+        <w:t>        if (seat2Typist != null) {</w:t>
+      </w:r>
+    </w:p>
+    <w:p>
+      <w:r>
+        <w:t>            seat2Typist.resetToStart();</w:t>
+      </w:r>
+    </w:p>
+    <w:p>
+      <w:r>
+        <w:t>        }</w:t>
+      </w:r>
+    </w:p>
+    <w:p>
+      <w:r>
+        <w:t>        if (seat3Typist != null) {</w:t>
+      </w:r>
+    </w:p>
+    <w:p>
+      <w:r>
+        <w:t>            seat3Typist.resetToStart();</w:t>
+      </w:r>
+    </w:p>
+    <w:p>
+      <w:r>
+        <w:t>        }</w:t>
+      </w:r>
+    </w:p>
+    <w:p/>
+    <w:p>
+      <w:r>
+        <w:t>The</w:t>
+      </w:r>
+      <w:r>
+        <w:t xml:space="preserve"> third problem</w:t>
+      </w:r>
+      <w:r>
+        <w:t xml:space="preserve"> was with the mistype probability in </w:t>
+      </w:r>
+      <w:proofErr w:type="spellStart"/>
+      <w:r>
+        <w:t>advanceTypist</w:t>
+      </w:r>
+      <w:proofErr w:type="spellEnd"/>
+      <w:r>
+        <w:t xml:space="preserve">(). </w:t>
+      </w:r>
+      <w:r>
+        <w:t>Originally,</w:t>
+      </w:r>
+      <w:r>
+        <w:t xml:space="preserve"> more accurate typists</w:t>
+      </w:r>
+      <w:r>
+        <w:t xml:space="preserve"> were</w:t>
+      </w:r>
+      <w:r>
+        <w:t xml:space="preserve"> more likely to mistype, which is unfair a</w:t>
+      </w:r>
+      <w:r>
+        <w:t>nd impossible</w:t>
+      </w:r>
+      <w:r>
+        <w:t xml:space="preserve">. I changed </w:t>
+      </w:r>
+      <w:r>
+        <w:t>it</w:t>
+      </w:r>
+      <w:r>
+        <w:t xml:space="preserve"> so the chance of mistyping depends on (1 - accuracy). </w:t>
+      </w:r>
+      <w:r>
+        <w:t>So now,</w:t>
+      </w:r>
+      <w:r>
+        <w:t xml:space="preserve"> higher accuracy </w:t>
+      </w:r>
+      <w:r>
+        <w:t>means</w:t>
+      </w:r>
+      <w:r>
+        <w:t xml:space="preserve"> a lower chance of making a mistake.</w:t>
+      </w:r>
+      <w:r>
+        <w:t xml:space="preserve"> </w:t>
+      </w:r>
+    </w:p>
+    <w:p>
+      <w:r>
+        <w:t xml:space="preserve">Code: </w:t>
+      </w:r>
+      <w:r>
+        <w:t>if (</w:t>
+      </w:r>
+      <w:proofErr w:type="spellStart"/>
+      <w:r>
+        <w:t>Math.random</w:t>
+      </w:r>
+      <w:proofErr w:type="spellEnd"/>
+      <w:r>
+        <w:t xml:space="preserve">() &lt; (1 - </w:t>
+      </w:r>
+      <w:proofErr w:type="spellStart"/>
+      <w:r>
+        <w:t>theTypist.getAccuracy</w:t>
+      </w:r>
+      <w:proofErr w:type="spellEnd"/>
+      <w:r>
+        <w:t>())</w:t>
+      </w:r>
+    </w:p>
+    <w:p/>
+    <w:p>
+      <w:r>
+        <w:t xml:space="preserve">The race finish condition in </w:t>
+      </w:r>
+      <w:proofErr w:type="spellStart"/>
+      <w:r>
+        <w:t>raceFinishedBy</w:t>
+      </w:r>
+      <w:proofErr w:type="spellEnd"/>
+      <w:r>
+        <w:t xml:space="preserve">() was also incorrect. The original code checked whether progress was exactly equal to </w:t>
+      </w:r>
+      <w:proofErr w:type="spellStart"/>
+      <w:r>
+        <w:t>passageLength</w:t>
+      </w:r>
+      <w:proofErr w:type="spellEnd"/>
+      <w:r>
+        <w:t>. This could give wrong behaviour if a typist’s progress went past the target. For example, if the passage length was 40 and the typist reached 41, they should still win. I fixed this by using &gt;= instead of ==. The correct implementation should declare a winner when progress is greater than or equal to the passage length.</w:t>
+      </w:r>
+    </w:p>
+    <w:p/>
+    <w:p>
+      <w:r>
+        <w:t xml:space="preserve">Another issue was that the winner was not printed at the end of the race. This caused incomplete output because the race ended but did not clearly show who won. I fixed this by storing the winning typist in a winner variable and printing their name and final </w:t>
+      </w:r>
+      <w:r>
+        <w:lastRenderedPageBreak/>
+        <w:t>accuracy after the loop. The correct implementation should announce the winner once the race finishes.</w:t>
+      </w:r>
+    </w:p>
+    <w:p/>
+    <w:p>
+      <w:r>
+        <w:t xml:space="preserve">There were also display issues in </w:t>
+      </w:r>
+      <w:proofErr w:type="spellStart"/>
+      <w:r>
+        <w:t>printSeat</w:t>
+      </w:r>
+      <w:proofErr w:type="spellEnd"/>
+      <w:r>
+        <w:t>(). If a typist’s progress went past the passage length, the spacing calculation could become incorrect and affect the race display. I fixed this by limiting the displayed progress to the passage length before calculating spaces. The correct implementation should keep the visual output readable even if the internal progress overshoots.</w:t>
+      </w:r>
+    </w:p>
+    <w:p/>
+    <w:p>
+      <w:r>
+        <w:t>Finally, when a typist was burnt out, the extra ~ symbol could cause spacing issues in the lane display. I adjusted the spacing so that it does not become negative. The correct implementation should show burnout clearly without breaking the formatting.</w:t>
+      </w:r>
+    </w:p>
+    <w:p/>
+    <w:p>
+      <w:r>
+        <w:t>Overall, these fixes improved the correctness, fairness, stability, and readability of the simulation. The final version now handles race completion, empty seats, mistypes, burnout display, and winner output more reliably.</w:t>
+      </w:r>
     </w:p>
     <w:sectPr>
       <w:pgSz w:w="11906" w:h="16838"/>

</xml_diff>

<commit_message>
Finalised Part 1 report with TypingRace bug analysis and fixes
</commit_message>
<xml_diff>
--- a/Part1/Typist Class Report OOP.docx
+++ b/Part1/Typist Class Report OOP.docx
@@ -229,12 +229,26 @@
         <w:rPr>
           <w:lang w:val="en-US"/>
         </w:rPr>
-        <w:t>, without actually altering the object</w:t>
-      </w:r>
+        <w:t xml:space="preserve">, without </w:t>
+      </w:r>
+      <w:proofErr w:type="gramStart"/>
       <w:r>
         <w:rPr>
           <w:lang w:val="en-US"/>
         </w:rPr>
+        <w:t>actually altering</w:t>
+      </w:r>
+      <w:proofErr w:type="gramEnd"/>
+      <w:r>
+        <w:rPr>
+          <w:lang w:val="en-US"/>
+        </w:rPr>
+        <w:t xml:space="preserve"> the object</w:t>
+      </w:r>
+      <w:r>
+        <w:rPr>
+          <w:lang w:val="en-US"/>
+        </w:rPr>
         <w:t xml:space="preserve"> or its fields</w:t>
       </w:r>
       <w:r>
@@ -250,23 +264,33 @@
         <w:t xml:space="preserve"> </w:t>
       </w:r>
       <w:proofErr w:type="spellStart"/>
+      <w:proofErr w:type="gramStart"/>
       <w:r>
         <w:t>getName</w:t>
       </w:r>
       <w:proofErr w:type="spellEnd"/>
       <w:r>
-        <w:t>()</w:t>
+        <w:t>(</w:t>
+      </w:r>
+      <w:proofErr w:type="gramEnd"/>
+      <w:r>
+        <w:t>)</w:t>
       </w:r>
       <w:r>
         <w:t xml:space="preserve">, </w:t>
       </w:r>
       <w:proofErr w:type="spellStart"/>
+      <w:proofErr w:type="gramStart"/>
       <w:r>
         <w:t>getSymbol</w:t>
       </w:r>
       <w:proofErr w:type="spellEnd"/>
       <w:r>
-        <w:t>()</w:t>
+        <w:t>(</w:t>
+      </w:r>
+      <w:proofErr w:type="gramEnd"/>
+      <w:r>
+        <w:t>)</w:t>
       </w:r>
       <w:r>
         <w:t>,</w:t>
@@ -275,12 +299,17 @@
         <w:t xml:space="preserve"> </w:t>
       </w:r>
       <w:proofErr w:type="spellStart"/>
+      <w:proofErr w:type="gramStart"/>
       <w:r>
         <w:t>getProgress</w:t>
       </w:r>
       <w:proofErr w:type="spellEnd"/>
       <w:r>
-        <w:t>()</w:t>
+        <w:t>(</w:t>
+      </w:r>
+      <w:proofErr w:type="gramEnd"/>
+      <w:r>
+        <w:t>)</w:t>
       </w:r>
       <w:r>
         <w:t>,</w:t>
@@ -289,12 +318,17 @@
         <w:t xml:space="preserve"> </w:t>
       </w:r>
       <w:proofErr w:type="spellStart"/>
+      <w:proofErr w:type="gramStart"/>
       <w:r>
         <w:t>getAccuracy</w:t>
       </w:r>
       <w:proofErr w:type="spellEnd"/>
       <w:r>
-        <w:t>()</w:t>
+        <w:t>(</w:t>
+      </w:r>
+      <w:proofErr w:type="gramEnd"/>
+      <w:r>
+        <w:t>)</w:t>
       </w:r>
       <w:r>
         <w:t>,</w:t>
@@ -303,12 +337,17 @@
         <w:t xml:space="preserve"> </w:t>
       </w:r>
       <w:proofErr w:type="spellStart"/>
+      <w:proofErr w:type="gramStart"/>
       <w:r>
         <w:t>getBurnoutTurnsRemaining</w:t>
       </w:r>
       <w:proofErr w:type="spellEnd"/>
       <w:r>
-        <w:t>()</w:t>
+        <w:t>(</w:t>
+      </w:r>
+      <w:proofErr w:type="gramEnd"/>
+      <w:r>
+        <w:t>)</w:t>
       </w:r>
       <w:r>
         <w:t>,</w:t>
@@ -317,12 +356,17 @@
         <w:t xml:space="preserve"> </w:t>
       </w:r>
       <w:proofErr w:type="spellStart"/>
+      <w:proofErr w:type="gramStart"/>
       <w:r>
         <w:t>isBurntOut</w:t>
       </w:r>
       <w:proofErr w:type="spellEnd"/>
       <w:r>
-        <w:t>()</w:t>
+        <w:t>(</w:t>
+      </w:r>
+      <w:proofErr w:type="gramEnd"/>
+      <w:r>
+        <w:t>)</w:t>
       </w:r>
       <w:r>
         <w:t>.</w:t>
@@ -358,12 +402,17 @@
         <w:t xml:space="preserve">Typist class are: </w:t>
       </w:r>
       <w:proofErr w:type="spellStart"/>
+      <w:proofErr w:type="gramStart"/>
       <w:r>
         <w:t>setSymbol</w:t>
       </w:r>
       <w:proofErr w:type="spellEnd"/>
       <w:r>
-        <w:t xml:space="preserve">(char </w:t>
+        <w:t>(</w:t>
+      </w:r>
+      <w:proofErr w:type="gramEnd"/>
+      <w:r>
+        <w:t xml:space="preserve">char </w:t>
       </w:r>
       <w:proofErr w:type="spellStart"/>
       <w:r>
@@ -377,12 +426,17 @@
         <w:t xml:space="preserve">, </w:t>
       </w:r>
       <w:proofErr w:type="spellStart"/>
+      <w:proofErr w:type="gramStart"/>
       <w:r>
         <w:t>setAccuracy</w:t>
       </w:r>
       <w:proofErr w:type="spellEnd"/>
       <w:r>
-        <w:t xml:space="preserve">(double </w:t>
+        <w:t>(</w:t>
+      </w:r>
+      <w:proofErr w:type="gramEnd"/>
+      <w:r>
+        <w:t xml:space="preserve">double </w:t>
       </w:r>
       <w:proofErr w:type="spellStart"/>
       <w:r>
@@ -399,12 +453,17 @@
         <w:t xml:space="preserve"> </w:t>
       </w:r>
       <w:proofErr w:type="spellStart"/>
+      <w:proofErr w:type="gramStart"/>
       <w:r>
         <w:t>typeCharacter</w:t>
       </w:r>
       <w:proofErr w:type="spellEnd"/>
       <w:r>
-        <w:t>()</w:t>
+        <w:t>(</w:t>
+      </w:r>
+      <w:proofErr w:type="gramEnd"/>
+      <w:r>
+        <w:t>)</w:t>
       </w:r>
       <w:r>
         <w:t>,</w:t>
@@ -413,12 +472,17 @@
         <w:t xml:space="preserve"> </w:t>
       </w:r>
       <w:proofErr w:type="spellStart"/>
+      <w:proofErr w:type="gramStart"/>
       <w:r>
         <w:t>slideBack</w:t>
       </w:r>
       <w:proofErr w:type="spellEnd"/>
       <w:r>
-        <w:t>(int amount)</w:t>
+        <w:t>(</w:t>
+      </w:r>
+      <w:proofErr w:type="gramEnd"/>
+      <w:r>
+        <w:t>int amount)</w:t>
       </w:r>
       <w:r>
         <w:t>,</w:t>
@@ -427,12 +491,17 @@
         <w:t xml:space="preserve"> </w:t>
       </w:r>
       <w:proofErr w:type="spellStart"/>
+      <w:proofErr w:type="gramStart"/>
       <w:r>
         <w:t>burnOut</w:t>
       </w:r>
       <w:proofErr w:type="spellEnd"/>
       <w:r>
-        <w:t>(int turns)</w:t>
+        <w:t>(</w:t>
+      </w:r>
+      <w:proofErr w:type="gramEnd"/>
+      <w:r>
+        <w:t>int turns)</w:t>
       </w:r>
       <w:r>
         <w:t>,</w:t>
@@ -441,12 +510,17 @@
         <w:t xml:space="preserve"> </w:t>
       </w:r>
       <w:proofErr w:type="spellStart"/>
+      <w:proofErr w:type="gramStart"/>
       <w:r>
         <w:t>recoverFromBurnout</w:t>
       </w:r>
       <w:proofErr w:type="spellEnd"/>
       <w:r>
-        <w:t>()</w:t>
+        <w:t>(</w:t>
+      </w:r>
+      <w:proofErr w:type="gramEnd"/>
+      <w:r>
+        <w:t>)</w:t>
       </w:r>
       <w:r>
         <w:t>,</w:t>
@@ -455,12 +529,17 @@
         <w:t xml:space="preserve"> </w:t>
       </w:r>
       <w:proofErr w:type="spellStart"/>
+      <w:proofErr w:type="gramStart"/>
       <w:r>
         <w:t>resetToStart</w:t>
       </w:r>
       <w:proofErr w:type="spellEnd"/>
       <w:r>
-        <w:t>()</w:t>
+        <w:t>(</w:t>
+      </w:r>
+      <w:proofErr w:type="gramEnd"/>
+      <w:r>
+        <w:t>)</w:t>
       </w:r>
       <w:r>
         <w:t>.</w:t>
@@ -472,12 +551,17 @@
         <w:t xml:space="preserve">The </w:t>
       </w:r>
       <w:proofErr w:type="spellStart"/>
+      <w:proofErr w:type="gramStart"/>
       <w:r>
         <w:t>slideBack</w:t>
       </w:r>
       <w:proofErr w:type="spellEnd"/>
       <w:r>
-        <w:t xml:space="preserve">() method </w:t>
+        <w:t>(</w:t>
+      </w:r>
+      <w:proofErr w:type="gramEnd"/>
+      <w:r>
+        <w:t xml:space="preserve">) method </w:t>
       </w:r>
       <w:r>
         <w:t>reverses the typist’s progress if they make a mistake.</w:t>
@@ -513,12 +597,17 @@
         <w:t xml:space="preserve">The </w:t>
       </w:r>
       <w:proofErr w:type="spellStart"/>
+      <w:proofErr w:type="gramStart"/>
       <w:r>
         <w:t>setAccuracy</w:t>
       </w:r>
       <w:proofErr w:type="spellEnd"/>
       <w:r>
-        <w:t>() method modifies the typist’s accuracy rating</w:t>
+        <w:t>(</w:t>
+      </w:r>
+      <w:proofErr w:type="gramEnd"/>
+      <w:r>
+        <w:t>) method modifies the typist’s accuracy rating</w:t>
       </w:r>
       <w:r>
         <w:t>, ensuring it stays between the range of 0</w:t>
@@ -670,6 +759,7 @@
         </w:rPr>
       </w:pPr>
       <w:proofErr w:type="spellStart"/>
+      <w:proofErr w:type="gramStart"/>
       <w:r>
         <w:rPr>
           <w:u w:val="single"/>
@@ -681,7 +771,14 @@
         <w:rPr>
           <w:u w:val="single"/>
         </w:rPr>
-        <w:t>() Test</w:t>
+        <w:t>(</w:t>
+      </w:r>
+      <w:proofErr w:type="gramEnd"/>
+      <w:r>
+        <w:rPr>
+          <w:u w:val="single"/>
+        </w:rPr>
+        <w:t>) Test</w:t>
       </w:r>
       <w:r>
         <w:rPr>
@@ -695,12 +792,17 @@
         <w:t xml:space="preserve">I called </w:t>
       </w:r>
       <w:proofErr w:type="spellStart"/>
+      <w:proofErr w:type="gramStart"/>
       <w:r>
         <w:t>typeCharacter</w:t>
       </w:r>
       <w:proofErr w:type="spellEnd"/>
       <w:r>
-        <w:t xml:space="preserve">() for the object of class Typist called test 3 times, so </w:t>
+        <w:t>(</w:t>
+      </w:r>
+      <w:proofErr w:type="gramEnd"/>
+      <w:r>
+        <w:t xml:space="preserve">) for the object of class Typist called test 3 times, so </w:t>
       </w:r>
       <w:r>
         <w:t xml:space="preserve">I printed a line that said </w:t>
@@ -721,21 +823,27 @@
         <w:t xml:space="preserve">The test also confirmed the progress was 3 so </w:t>
       </w:r>
       <w:proofErr w:type="spellStart"/>
+      <w:proofErr w:type="gramStart"/>
       <w:r>
         <w:t>typeCharacter</w:t>
       </w:r>
       <w:proofErr w:type="spellEnd"/>
       <w:r>
-        <w:t>() moves forward normally.</w:t>
-      </w:r>
-    </w:p>
-    <w:p>
-      <w:pPr>
-        <w:rPr>
-          <w:u w:val="single"/>
-        </w:rPr>
-      </w:pPr>
-      <w:proofErr w:type="spellStart"/>
+        <w:t>(</w:t>
+      </w:r>
+      <w:proofErr w:type="gramEnd"/>
+      <w:r>
+        <w:t>) moves forward normally.</w:t>
+      </w:r>
+    </w:p>
+    <w:p>
+      <w:pPr>
+        <w:rPr>
+          <w:u w:val="single"/>
+        </w:rPr>
+      </w:pPr>
+      <w:proofErr w:type="spellStart"/>
+      <w:proofErr w:type="gramStart"/>
       <w:r>
         <w:rPr>
           <w:u w:val="single"/>
@@ -747,7 +855,14 @@
         <w:rPr>
           <w:u w:val="single"/>
         </w:rPr>
-        <w:t>() Test</w:t>
+        <w:t>(</w:t>
+      </w:r>
+      <w:proofErr w:type="gramEnd"/>
+      <w:r>
+        <w:rPr>
+          <w:u w:val="single"/>
+        </w:rPr>
+        <w:t>) Test</w:t>
       </w:r>
       <w:r>
         <w:rPr>
@@ -823,11 +938,19 @@
           <w:u w:val="single"/>
         </w:rPr>
       </w:pPr>
-      <w:r>
-        <w:rPr>
-          <w:u w:val="single"/>
-        </w:rPr>
-        <w:t>burnout()</w:t>
+      <w:proofErr w:type="gramStart"/>
+      <w:r>
+        <w:rPr>
+          <w:u w:val="single"/>
+        </w:rPr>
+        <w:t>burnout(</w:t>
+      </w:r>
+      <w:proofErr w:type="gramEnd"/>
+      <w:r>
+        <w:rPr>
+          <w:u w:val="single"/>
+        </w:rPr>
+        <w:t>)</w:t>
       </w:r>
       <w:r>
         <w:rPr>
@@ -852,12 +975,17 @@
         <w:t xml:space="preserve">I called </w:t>
       </w:r>
       <w:proofErr w:type="spellStart"/>
+      <w:proofErr w:type="gramStart"/>
       <w:r>
         <w:t>burnOut</w:t>
       </w:r>
       <w:proofErr w:type="spellEnd"/>
       <w:r>
-        <w:t xml:space="preserve">() for the </w:t>
+        <w:t>(</w:t>
+      </w:r>
+      <w:proofErr w:type="gramEnd"/>
+      <w:r>
+        <w:t xml:space="preserve">) for the </w:t>
       </w:r>
       <w:r>
         <w:t xml:space="preserve">same </w:t>
@@ -912,6 +1040,7 @@
         </w:rPr>
       </w:pPr>
       <w:proofErr w:type="spellStart"/>
+      <w:proofErr w:type="gramStart"/>
       <w:r>
         <w:rPr>
           <w:u w:val="single"/>
@@ -929,7 +1058,14 @@
         <w:rPr>
           <w:u w:val="single"/>
         </w:rPr>
-        <w:t>()</w:t>
+        <w:t>(</w:t>
+      </w:r>
+      <w:proofErr w:type="gramEnd"/>
+      <w:r>
+        <w:rPr>
+          <w:u w:val="single"/>
+        </w:rPr>
+        <w:t>)</w:t>
       </w:r>
       <w:r>
         <w:rPr>
@@ -954,12 +1090,17 @@
         <w:t xml:space="preserve">I called </w:t>
       </w:r>
       <w:proofErr w:type="spellStart"/>
+      <w:proofErr w:type="gramStart"/>
       <w:r>
         <w:t>setAccuracy</w:t>
       </w:r>
       <w:proofErr w:type="spellEnd"/>
       <w:r>
-        <w:t xml:space="preserve">() for the </w:t>
+        <w:t>(</w:t>
+      </w:r>
+      <w:proofErr w:type="gramEnd"/>
+      <w:r>
+        <w:t xml:space="preserve">) for the </w:t>
       </w:r>
       <w:r>
         <w:t xml:space="preserve">same </w:t>
@@ -1041,6 +1182,7 @@
         </w:rPr>
       </w:pPr>
       <w:proofErr w:type="spellStart"/>
+      <w:proofErr w:type="gramStart"/>
       <w:r>
         <w:rPr>
           <w:u w:val="single"/>
@@ -1052,7 +1194,14 @@
         <w:rPr>
           <w:u w:val="single"/>
         </w:rPr>
-        <w:t>() Test</w:t>
+        <w:t>(</w:t>
+      </w:r>
+      <w:proofErr w:type="gramEnd"/>
+      <w:r>
+        <w:rPr>
+          <w:u w:val="single"/>
+        </w:rPr>
+        <w:t>) Test</w:t>
       </w:r>
       <w:r>
         <w:rPr>
@@ -1071,12 +1220,17 @@
         <w:t xml:space="preserve">I called </w:t>
       </w:r>
       <w:proofErr w:type="spellStart"/>
+      <w:proofErr w:type="gramStart"/>
       <w:r>
         <w:t>resetToStart</w:t>
       </w:r>
       <w:proofErr w:type="spellEnd"/>
       <w:r>
-        <w:t xml:space="preserve">() for the </w:t>
+        <w:t>(</w:t>
+      </w:r>
+      <w:proofErr w:type="gramEnd"/>
+      <w:r>
+        <w:t xml:space="preserve">) for the </w:t>
       </w:r>
       <w:r>
         <w:t xml:space="preserve">same </w:t>
@@ -1259,7 +1413,7 @@
         <w:t xml:space="preserve"> issues.</w:t>
       </w:r>
       <w:r>
-        <w:t xml:space="preserve"> These were all major issues that didn’t allow the race to work correctly.</w:t>
+        <w:t xml:space="preserve"> These were all issues that didn’t allow the race to work correctly.</w:t>
       </w:r>
       <w:r>
         <w:t xml:space="preserve"> I fixed these </w:t>
@@ -1298,20 +1452,30 @@
         <w:t xml:space="preserve">leftover progress or burnout from a previous race. I fixed this in </w:t>
       </w:r>
       <w:proofErr w:type="spellStart"/>
+      <w:proofErr w:type="gramStart"/>
       <w:r>
         <w:t>startRace</w:t>
       </w:r>
       <w:proofErr w:type="spellEnd"/>
       <w:r>
-        <w:t xml:space="preserve">() by calling </w:t>
-      </w:r>
-      <w:proofErr w:type="spellStart"/>
+        <w:t>(</w:t>
+      </w:r>
+      <w:proofErr w:type="gramEnd"/>
+      <w:r>
+        <w:t xml:space="preserve">) by calling </w:t>
+      </w:r>
+      <w:proofErr w:type="spellStart"/>
+      <w:proofErr w:type="gramStart"/>
       <w:r>
         <w:t>resetToStart</w:t>
       </w:r>
       <w:proofErr w:type="spellEnd"/>
       <w:r>
-        <w:t xml:space="preserve">() for </w:t>
+        <w:t>(</w:t>
+      </w:r>
+      <w:proofErr w:type="gramEnd"/>
+      <w:r>
+        <w:t xml:space="preserve">) for </w:t>
       </w:r>
       <w:r>
         <w:t>s</w:t>
@@ -1365,36 +1529,59 @@
         <w:t xml:space="preserve"> crash when methods like </w:t>
       </w:r>
       <w:proofErr w:type="spellStart"/>
+      <w:proofErr w:type="gramStart"/>
       <w:r>
         <w:t>resetToStart</w:t>
       </w:r>
       <w:proofErr w:type="spellEnd"/>
       <w:r>
-        <w:t xml:space="preserve">(), </w:t>
-      </w:r>
-      <w:proofErr w:type="spellStart"/>
+        <w:t>(</w:t>
+      </w:r>
+      <w:proofErr w:type="gramEnd"/>
+      <w:r>
+        <w:t xml:space="preserve">), </w:t>
+      </w:r>
+      <w:proofErr w:type="spellStart"/>
+      <w:proofErr w:type="gramStart"/>
       <w:r>
         <w:t>advanceTypist</w:t>
       </w:r>
       <w:proofErr w:type="spellEnd"/>
       <w:r>
-        <w:t xml:space="preserve">(), </w:t>
-      </w:r>
-      <w:proofErr w:type="spellStart"/>
+        <w:t>(</w:t>
+      </w:r>
+      <w:proofErr w:type="gramEnd"/>
+      <w:r>
+        <w:t xml:space="preserve">), </w:t>
+      </w:r>
+      <w:proofErr w:type="spellStart"/>
+      <w:proofErr w:type="gramStart"/>
       <w:r>
         <w:t>raceFinishedBy</w:t>
       </w:r>
       <w:proofErr w:type="spellEnd"/>
       <w:r>
-        <w:t xml:space="preserve">(), or </w:t>
-      </w:r>
-      <w:proofErr w:type="spellStart"/>
+        <w:t>(</w:t>
+      </w:r>
+      <w:proofErr w:type="gramEnd"/>
+      <w:r>
+        <w:t xml:space="preserve">), or </w:t>
+      </w:r>
+      <w:proofErr w:type="spellStart"/>
+      <w:proofErr w:type="gramStart"/>
       <w:r>
         <w:t>printSeat</w:t>
       </w:r>
       <w:proofErr w:type="spellEnd"/>
       <w:r>
-        <w:t>() were called. I fixed this by checking whether the typist is null before using it. The correct implementation should ignore empty seats instead of crashing.</w:t>
+        <w:t>(</w:t>
+      </w:r>
+      <w:proofErr w:type="gramEnd"/>
+      <w:r>
+        <w:t>) were called. I fixed this by checking whether the typist is null before using it. The correct implementation should ignore empty seats instead of crashing.</w:t>
+      </w:r>
+      <w:r>
+        <w:t xml:space="preserve"> </w:t>
       </w:r>
     </w:p>
     <w:p>
@@ -1402,7 +1589,15 @@
         <w:t xml:space="preserve">Code: </w:t>
       </w:r>
       <w:r>
-        <w:t>if (seat1Typist != null) {</w:t>
+        <w:t>if (seat1</w:t>
+      </w:r>
+      <w:proofErr w:type="gramStart"/>
+      <w:r>
+        <w:t>Typist !</w:t>
+      </w:r>
+      <w:proofErr w:type="gramEnd"/>
+      <w:r>
+        <w:t>= null) {</w:t>
       </w:r>
     </w:p>
     <w:p>
@@ -1417,7 +1612,15 @@
     </w:p>
     <w:p>
       <w:r>
-        <w:t>        if (seat2Typist != null) {</w:t>
+        <w:t>        if (seat2</w:t>
+      </w:r>
+      <w:proofErr w:type="gramStart"/>
+      <w:r>
+        <w:t>Typist !</w:t>
+      </w:r>
+      <w:proofErr w:type="gramEnd"/>
+      <w:r>
+        <w:t>= null) {</w:t>
       </w:r>
     </w:p>
     <w:p>
@@ -1432,7 +1635,15 @@
     </w:p>
     <w:p>
       <w:r>
-        <w:t>        if (seat3Typist != null) {</w:t>
+        <w:t>        if (seat3</w:t>
+      </w:r>
+      <w:proofErr w:type="gramStart"/>
+      <w:r>
+        <w:t>Typist !</w:t>
+      </w:r>
+      <w:proofErr w:type="gramEnd"/>
+      <w:r>
+        <w:t>= null) {</w:t>
       </w:r>
     </w:p>
     <w:p>
@@ -1457,12 +1668,17 @@
         <w:t xml:space="preserve"> was with the mistype probability in </w:t>
       </w:r>
       <w:proofErr w:type="spellStart"/>
+      <w:proofErr w:type="gramStart"/>
       <w:r>
         <w:t>advanceTypist</w:t>
       </w:r>
       <w:proofErr w:type="spellEnd"/>
       <w:r>
-        <w:t xml:space="preserve">(). </w:t>
+        <w:t>(</w:t>
+      </w:r>
+      <w:proofErr w:type="gramEnd"/>
+      <w:r>
+        <w:t xml:space="preserve">). </w:t>
       </w:r>
       <w:r>
         <w:t>Originally,</w:t>
@@ -1477,7 +1693,10 @@
         <w:t xml:space="preserve"> more likely to mistype, which is unfair a</w:t>
       </w:r>
       <w:r>
-        <w:t>nd impossible</w:t>
+        <w:t xml:space="preserve">nd </w:t>
+      </w:r>
+      <w:r>
+        <w:t>counterintuitive</w:t>
       </w:r>
       <w:r>
         <w:t xml:space="preserve">. I changed </w:t>
@@ -1534,12 +1753,17 @@
         <w:t xml:space="preserve">The race finish condition in </w:t>
       </w:r>
       <w:proofErr w:type="spellStart"/>
+      <w:proofErr w:type="gramStart"/>
       <w:r>
         <w:t>raceFinishedBy</w:t>
       </w:r>
       <w:proofErr w:type="spellEnd"/>
       <w:r>
-        <w:t xml:space="preserve">() was also incorrect. The original code checked whether progress was exactly equal to </w:t>
+        <w:t>(</w:t>
+      </w:r>
+      <w:proofErr w:type="gramEnd"/>
+      <w:r>
+        <w:t xml:space="preserve">) was also incorrect. The original code checked whether progress was exactly equal to </w:t>
       </w:r>
       <w:proofErr w:type="spellStart"/>
       <w:r>
@@ -1547,43 +1771,314 @@
       </w:r>
       <w:proofErr w:type="spellEnd"/>
       <w:r>
-        <w:t>. This could give wrong behaviour if a typist’s progress went past the target. For example, if the passage length was 40 and the typist reached 41, they should still win. I fixed this by using &gt;= instead of ==. The correct implementation should declare a winner when progress is greater than or equal to the passage length.</w:t>
+        <w:t xml:space="preserve">. This </w:t>
+      </w:r>
+      <w:r>
+        <w:t>is</w:t>
+      </w:r>
+      <w:r>
+        <w:t xml:space="preserve"> wrong if a typist’s progress went past the target. For example, if the passage length was 40 and the typist reached 41, they should still win. I fixed this by using &gt;= instead of ==. The correct implementation should declare a winner when progress is greater than or equal to the passage length.</w:t>
+      </w:r>
+    </w:p>
+    <w:p>
+      <w:r>
+        <w:t xml:space="preserve">Code: </w:t>
+      </w:r>
+      <w:r>
+        <w:t>if (</w:t>
+      </w:r>
+      <w:proofErr w:type="spellStart"/>
+      <w:r>
+        <w:t>theTypist.getProgress</w:t>
+      </w:r>
+      <w:proofErr w:type="spellEnd"/>
+      <w:r>
+        <w:t xml:space="preserve">() &gt;= </w:t>
+      </w:r>
+      <w:proofErr w:type="spellStart"/>
+      <w:r>
+        <w:t>passageLength</w:t>
+      </w:r>
+      <w:proofErr w:type="spellEnd"/>
+      <w:r>
+        <w:t>)</w:t>
       </w:r>
     </w:p>
     <w:p/>
     <w:p>
       <w:r>
-        <w:t xml:space="preserve">Another issue was that the winner was not printed at the end of the race. This caused incomplete output because the race ended but did not clearly show who won. I fixed this by storing the winning typist in a winner variable and printing their name and final </w:t>
+        <w:t xml:space="preserve">Another issue was that the winner was not printed at the end of the race. This </w:t>
+      </w:r>
+      <w:r>
+        <w:t>is not good</w:t>
+      </w:r>
+      <w:r>
+        <w:t xml:space="preserve"> because the race ended but did not clearly show</w:t>
+      </w:r>
+      <w:r>
+        <w:t xml:space="preserve"> the winner</w:t>
+      </w:r>
+      <w:r>
+        <w:t xml:space="preserve">. I fixed this by storing </w:t>
       </w:r>
       <w:r>
         <w:lastRenderedPageBreak/>
-        <w:t>accuracy after the loop. The correct implementation should announce the winner once the race finishes.</w:t>
+        <w:t xml:space="preserve">the winning typist in a winner variable and printing their name and final accuracy. The correct implementation should </w:t>
+      </w:r>
+      <w:r>
+        <w:t>output</w:t>
+      </w:r>
+      <w:r>
+        <w:t xml:space="preserve"> the winner once the race finishes.</w:t>
+      </w:r>
+    </w:p>
+    <w:p>
+      <w:r>
+        <w:t>Code:</w:t>
+      </w:r>
+      <w:r>
+        <w:t xml:space="preserve"> </w:t>
+      </w:r>
+      <w:proofErr w:type="spellStart"/>
+      <w:r>
+        <w:t>System.out.println</w:t>
+      </w:r>
+      <w:proofErr w:type="spellEnd"/>
+      <w:r>
+        <w:t>("</w:t>
+      </w:r>
+      <w:r>
+        <w:rPr>
+          <w:rFonts w:ascii="Segoe UI Emoji" w:hAnsi="Segoe UI Emoji" w:cs="Segoe UI Emoji"/>
+        </w:rPr>
+        <w:t>🏁</w:t>
+      </w:r>
+      <w:r>
+        <w:t xml:space="preserve"> " + </w:t>
+      </w:r>
+      <w:proofErr w:type="spellStart"/>
+      <w:proofErr w:type="gramStart"/>
+      <w:r>
+        <w:t>winner.getName</w:t>
+      </w:r>
+      <w:proofErr w:type="spellEnd"/>
+      <w:proofErr w:type="gramEnd"/>
+      <w:r>
+        <w:t>() + " wins the race!");</w:t>
       </w:r>
     </w:p>
     <w:p/>
     <w:p>
       <w:r>
-        <w:t xml:space="preserve">There were also display issues in </w:t>
-      </w:r>
-      <w:proofErr w:type="spellStart"/>
+        <w:t xml:space="preserve">There were also issues in </w:t>
+      </w:r>
+      <w:proofErr w:type="spellStart"/>
+      <w:proofErr w:type="gramStart"/>
       <w:r>
         <w:t>printSeat</w:t>
       </w:r>
       <w:proofErr w:type="spellEnd"/>
       <w:r>
-        <w:t>(). If a typist’s progress went past the passage length, the spacing calculation could become incorrect and affect the race display. I fixed this by limiting the displayed progress to the passage length before calculating spaces. The correct implementation should keep the visual output readable even if the internal progress overshoots.</w:t>
+        <w:t>(</w:t>
+      </w:r>
+      <w:proofErr w:type="gramEnd"/>
+      <w:r>
+        <w:t>). If a typist’s progress went past the passage length, the spacing</w:t>
+      </w:r>
+      <w:r>
+        <w:t xml:space="preserve"> </w:t>
+      </w:r>
+      <w:r>
+        <w:t xml:space="preserve">could become incorrect and affect the race </w:t>
+      </w:r>
+      <w:r>
+        <w:t>picture</w:t>
+      </w:r>
+      <w:r>
+        <w:t xml:space="preserve">. I fixed this by </w:t>
+      </w:r>
+      <w:r>
+        <w:t>keeping</w:t>
+      </w:r>
+      <w:r>
+        <w:t xml:space="preserve"> the displayed progress </w:t>
+      </w:r>
+      <w:r>
+        <w:t>as much as</w:t>
+      </w:r>
+      <w:r>
+        <w:t xml:space="preserve"> the passage length before calculating </w:t>
+      </w:r>
+      <w:r>
+        <w:t xml:space="preserve">the </w:t>
+      </w:r>
+      <w:r>
+        <w:t>spaces. The correct implementation should keep the visual output readable even if the progress overshoots.</w:t>
+      </w:r>
+    </w:p>
+    <w:p>
+      <w:r>
+        <w:t xml:space="preserve">Code: </w:t>
+      </w:r>
+      <w:r>
+        <w:t xml:space="preserve">if (progress &gt; </w:t>
+      </w:r>
+      <w:proofErr w:type="spellStart"/>
+      <w:r>
+        <w:t>passageLength</w:t>
+      </w:r>
+      <w:proofErr w:type="spellEnd"/>
+      <w:r>
+        <w:t>) {</w:t>
+      </w:r>
+    </w:p>
+    <w:p>
+      <w:r>
+        <w:t xml:space="preserve">            progress = </w:t>
+      </w:r>
+      <w:proofErr w:type="spellStart"/>
+      <w:r>
+        <w:t>passageLength</w:t>
+      </w:r>
+      <w:proofErr w:type="spellEnd"/>
+      <w:r>
+        <w:t>;</w:t>
+      </w:r>
+    </w:p>
+    <w:p>
+      <w:r>
+        <w:t>        }</w:t>
       </w:r>
     </w:p>
     <w:p/>
     <w:p>
       <w:r>
-        <w:t>Finally, when a typist was burnt out, the extra ~ symbol could cause spacing issues in the lane display. I adjusted the spacing so that it does not become negative. The correct implementation should show burnout clearly without breaking the formatting.</w:t>
+        <w:t>Finally, when a typist was burnt out, the extra ~ symbol could cause spacing issues. I adjusted the spacing so that it does not become negative. The correct implementation should show burnout clearly without breaking the formatting.</w:t>
+      </w:r>
+    </w:p>
+    <w:p>
+      <w:r>
+        <w:t xml:space="preserve">Code: </w:t>
+      </w:r>
+      <w:r>
+        <w:t>if (</w:t>
+      </w:r>
+      <w:proofErr w:type="spellStart"/>
+      <w:r>
+        <w:t>theTypist.isBurntOut</w:t>
+      </w:r>
+      <w:proofErr w:type="spellEnd"/>
+      <w:r>
+        <w:t>()) {</w:t>
+      </w:r>
+    </w:p>
+    <w:p>
+      <w:r>
+        <w:t xml:space="preserve">            </w:t>
+      </w:r>
+      <w:proofErr w:type="spellStart"/>
+      <w:r>
+        <w:t>System.out.print</w:t>
+      </w:r>
+      <w:proofErr w:type="spellEnd"/>
+      <w:r>
+        <w:t>('~');</w:t>
+      </w:r>
+    </w:p>
+    <w:p>
+      <w:r>
+        <w:t>            if (</w:t>
+      </w:r>
+      <w:proofErr w:type="spellStart"/>
+      <w:r>
+        <w:t>spacesAfter</w:t>
+      </w:r>
+      <w:proofErr w:type="spellEnd"/>
+      <w:r>
+        <w:t xml:space="preserve"> &gt; 0) {</w:t>
+      </w:r>
+    </w:p>
+    <w:p>
+      <w:r>
+        <w:t xml:space="preserve">                </w:t>
+      </w:r>
+      <w:proofErr w:type="spellStart"/>
+      <w:r>
+        <w:t>spacesAfter</w:t>
+      </w:r>
+      <w:proofErr w:type="spellEnd"/>
+      <w:r>
+        <w:t>--; // ~ takes one character space</w:t>
+      </w:r>
+    </w:p>
+    <w:p>
+      <w:r>
+        <w:t>            }</w:t>
+      </w:r>
+    </w:p>
+    <w:p>
+      <w:r>
+        <w:t>        }</w:t>
       </w:r>
     </w:p>
     <w:p/>
     <w:p>
       <w:r>
-        <w:t>Overall, these fixes improved the correctness, fairness, stability, and readability of the simulation. The final version now handles race completion, empty seats, mistypes, burnout display, and winner output more reliably.</w:t>
+        <w:t xml:space="preserve">Overall, these fixes </w:t>
+      </w:r>
+      <w:r>
+        <w:t>made the race</w:t>
+      </w:r>
+      <w:r>
+        <w:t xml:space="preserve"> correct</w:t>
+      </w:r>
+      <w:r>
+        <w:t xml:space="preserve"> and</w:t>
+      </w:r>
+      <w:r>
+        <w:t xml:space="preserve"> fair</w:t>
+      </w:r>
+      <w:r>
+        <w:t>.</w:t>
+      </w:r>
+      <w:r>
+        <w:t xml:space="preserve"> </w:t>
+      </w:r>
+      <w:r>
+        <w:t xml:space="preserve">I also fixed the </w:t>
+      </w:r>
+      <w:r>
+        <w:t xml:space="preserve">readability of the </w:t>
+      </w:r>
+      <w:r>
+        <w:t>race’s picture</w:t>
+      </w:r>
+      <w:r>
+        <w:t xml:space="preserve">. </w:t>
+      </w:r>
+      <w:r>
+        <w:t>N</w:t>
+      </w:r>
+      <w:r>
+        <w:t>ow</w:t>
+      </w:r>
+      <w:r>
+        <w:t>, it</w:t>
+      </w:r>
+      <w:r>
+        <w:t xml:space="preserve"> handles </w:t>
+      </w:r>
+      <w:r>
+        <w:t xml:space="preserve">completing the </w:t>
+      </w:r>
+      <w:r>
+        <w:t xml:space="preserve">race, empty seats, mistypes, burnout display, and winner output </w:t>
+      </w:r>
+      <w:r>
+        <w:t>properly</w:t>
+      </w:r>
+      <w:r>
+        <w:t>.</w:t>
       </w:r>
     </w:p>
     <w:sectPr>

</xml_diff>

<commit_message>
Added mistype indicator and fixed Typist documentation
</commit_message>
<xml_diff>
--- a/Part1/Typist Class Report OOP.docx
+++ b/Part1/Typist Class Report OOP.docx
@@ -116,257 +116,229 @@
         <w:rPr>
           <w:lang w:val="en-US"/>
         </w:rPr>
-        <w:t xml:space="preserve">, which means other classes cannot change the game values directly (accuracy, progress, </w:t>
-      </w:r>
-      <w:proofErr w:type="spellStart"/>
+        <w:t xml:space="preserve">, which means other classes cannot change the game values directly (accuracy, progress, burnoutTurnsRemaining). This makes sure </w:t>
+      </w:r>
       <w:r>
         <w:rPr>
           <w:lang w:val="en-US"/>
         </w:rPr>
-        <w:t>burnoutTurnsRemaining</w:t>
-      </w:r>
-      <w:proofErr w:type="spellEnd"/>
+        <w:t>the object can’t enter any invalid states such as progress going below zero, or accuracy outside the range of 0 to 1.</w:t>
+      </w:r>
       <w:r>
         <w:rPr>
           <w:lang w:val="en-US"/>
         </w:rPr>
-        <w:t xml:space="preserve">). This makes sure </w:t>
+        <w:t xml:space="preserve"> Encapsulation allows code refactoring</w:t>
       </w:r>
       <w:r>
         <w:rPr>
           <w:lang w:val="en-US"/>
         </w:rPr>
-        <w:t>the object can’t enter any invalid states such as progress going below zero, or accuracy outside the range of 0 to 1.</w:t>
+        <w:t xml:space="preserve"> easily because </w:t>
       </w:r>
       <w:r>
         <w:rPr>
           <w:lang w:val="en-US"/>
         </w:rPr>
-        <w:t xml:space="preserve"> Encapsulation allows code refactoring</w:t>
+        <w:t>when modifying code, other parts of the program aren’t affected.</w:t>
       </w:r>
       <w:r>
         <w:rPr>
           <w:lang w:val="en-US"/>
         </w:rPr>
-        <w:t xml:space="preserve"> easily because </w:t>
+        <w:t xml:space="preserve"> </w:t>
       </w:r>
       <w:r>
         <w:rPr>
           <w:lang w:val="en-US"/>
         </w:rPr>
-        <w:t>when modifying code, other parts of the program aren’t affected.</w:t>
+        <w:t xml:space="preserve">It also </w:t>
       </w:r>
       <w:r>
         <w:rPr>
           <w:lang w:val="en-US"/>
         </w:rPr>
+        <w:t>supports abstraction.</w:t>
+      </w:r>
+    </w:p>
+    <w:p>
+      <w:pPr>
+        <w:rPr>
+          <w:lang w:val="en-US"/>
+        </w:rPr>
+      </w:pPr>
+    </w:p>
+    <w:p>
+      <w:r>
+        <w:rPr>
+          <w:lang w:val="en-US"/>
+        </w:rPr>
+        <w:t>Getters</w:t>
+      </w:r>
+      <w:r>
+        <w:rPr>
+          <w:lang w:val="en-US"/>
+        </w:rPr>
+        <w:t>(accessors)</w:t>
+      </w:r>
+      <w:r>
+        <w:rPr>
+          <w:lang w:val="en-US"/>
+        </w:rPr>
+        <w:t xml:space="preserve"> are </w:t>
+      </w:r>
+      <w:r>
+        <w:rPr>
+          <w:lang w:val="en-US"/>
+        </w:rPr>
+        <w:t>methods</w:t>
+      </w:r>
+      <w:r>
+        <w:rPr>
+          <w:lang w:val="en-US"/>
+        </w:rPr>
+        <w:t xml:space="preserve"> that ‘get’ a value (access </w:t>
+      </w:r>
+      <w:r>
+        <w:rPr>
+          <w:lang w:val="en-US"/>
+        </w:rPr>
+        <w:t xml:space="preserve">and return </w:t>
+      </w:r>
+      <w:r>
+        <w:rPr>
+          <w:lang w:val="en-US"/>
+        </w:rPr>
+        <w:t>the field) of the object</w:t>
+      </w:r>
+      <w:r>
+        <w:rPr>
+          <w:lang w:val="en-US"/>
+        </w:rPr>
+        <w:t>, without actually altering the object</w:t>
+      </w:r>
+      <w:r>
+        <w:rPr>
+          <w:lang w:val="en-US"/>
+        </w:rPr>
+        <w:t xml:space="preserve"> or its fields</w:t>
+      </w:r>
+      <w:r>
+        <w:rPr>
+          <w:lang w:val="en-US"/>
+        </w:rPr>
+        <w:t>. The getters included in the Typist class are:</w:t>
+      </w:r>
+      <w:r>
+        <w:rPr>
+          <w:lang w:val="en-US"/>
+        </w:rPr>
         <w:t xml:space="preserve"> </w:t>
       </w:r>
       <w:r>
-        <w:rPr>
-          <w:lang w:val="en-US"/>
-        </w:rPr>
-        <w:t xml:space="preserve">It also </w:t>
-      </w:r>
-      <w:r>
-        <w:rPr>
-          <w:lang w:val="en-US"/>
-        </w:rPr>
-        <w:t>supports abstraction.</w:t>
-      </w:r>
-    </w:p>
-    <w:p>
-      <w:pPr>
-        <w:rPr>
-          <w:lang w:val="en-US"/>
-        </w:rPr>
-      </w:pPr>
-    </w:p>
-    <w:p>
-      <w:r>
-        <w:rPr>
-          <w:lang w:val="en-US"/>
-        </w:rPr>
-        <w:t>Getters</w:t>
-      </w:r>
-      <w:r>
-        <w:rPr>
-          <w:lang w:val="en-US"/>
-        </w:rPr>
-        <w:t>(accessors)</w:t>
-      </w:r>
-      <w:r>
-        <w:rPr>
-          <w:lang w:val="en-US"/>
-        </w:rPr>
-        <w:t xml:space="preserve"> are </w:t>
-      </w:r>
-      <w:r>
-        <w:rPr>
-          <w:lang w:val="en-US"/>
-        </w:rPr>
-        <w:t>methods</w:t>
-      </w:r>
-      <w:r>
-        <w:rPr>
-          <w:lang w:val="en-US"/>
-        </w:rPr>
-        <w:t xml:space="preserve"> that ‘get’ a value (access </w:t>
-      </w:r>
-      <w:r>
-        <w:rPr>
-          <w:lang w:val="en-US"/>
-        </w:rPr>
-        <w:t xml:space="preserve">and return </w:t>
-      </w:r>
-      <w:r>
-        <w:rPr>
-          <w:lang w:val="en-US"/>
-        </w:rPr>
-        <w:t>the field) of the object</w:t>
-      </w:r>
-      <w:r>
-        <w:rPr>
-          <w:lang w:val="en-US"/>
-        </w:rPr>
-        <w:t xml:space="preserve">, without </w:t>
-      </w:r>
-      <w:proofErr w:type="gramStart"/>
-      <w:r>
-        <w:rPr>
-          <w:lang w:val="en-US"/>
-        </w:rPr>
-        <w:t>actually altering</w:t>
-      </w:r>
-      <w:proofErr w:type="gramEnd"/>
-      <w:r>
-        <w:rPr>
-          <w:lang w:val="en-US"/>
-        </w:rPr>
-        <w:t xml:space="preserve"> the object</w:t>
-      </w:r>
-      <w:r>
-        <w:rPr>
-          <w:lang w:val="en-US"/>
-        </w:rPr>
-        <w:t xml:space="preserve"> or its fields</w:t>
-      </w:r>
-      <w:r>
-        <w:rPr>
-          <w:lang w:val="en-US"/>
-        </w:rPr>
-        <w:t>. The getters included in the Typist class are:</w:t>
-      </w:r>
-      <w:r>
-        <w:rPr>
-          <w:lang w:val="en-US"/>
-        </w:rPr>
+        <w:t>getName()</w:t>
+      </w:r>
+      <w:r>
+        <w:t xml:space="preserve">, </w:t>
+      </w:r>
+      <w:r>
+        <w:t>getSymbol()</w:t>
+      </w:r>
+      <w:r>
+        <w:t>,</w:t>
+      </w:r>
+      <w:r>
+        <w:t xml:space="preserve"> getProgress()</w:t>
+      </w:r>
+      <w:r>
+        <w:t>,</w:t>
+      </w:r>
+      <w:r>
+        <w:t xml:space="preserve"> getAccuracy()</w:t>
+      </w:r>
+      <w:r>
+        <w:t>,</w:t>
+      </w:r>
+      <w:r>
+        <w:t xml:space="preserve"> getBurnoutTurnsRemaining()</w:t>
+      </w:r>
+      <w:r>
+        <w:t>,</w:t>
+      </w:r>
+      <w:r>
+        <w:t xml:space="preserve"> isBurntOut()</w:t>
+      </w:r>
+      <w:r>
+        <w:t>.</w:t>
+      </w:r>
+    </w:p>
+    <w:p/>
+    <w:p>
+      <w:r>
+        <w:t>Setters</w:t>
+      </w:r>
+      <w:r>
+        <w:t>(mutators)</w:t>
+      </w:r>
+      <w:r>
+        <w:t xml:space="preserve"> are</w:t>
+      </w:r>
+      <w:r>
+        <w:t xml:space="preserve"> methods that </w:t>
+      </w:r>
+      <w:r>
+        <w:t>‘set’</w:t>
+      </w:r>
+      <w:r>
         <w:t xml:space="preserve"> </w:t>
       </w:r>
-      <w:proofErr w:type="spellStart"/>
-      <w:proofErr w:type="gramStart"/>
-      <w:r>
-        <w:t>getName</w:t>
-      </w:r>
-      <w:proofErr w:type="spellEnd"/>
-      <w:r>
-        <w:t>(</w:t>
-      </w:r>
-      <w:proofErr w:type="gramEnd"/>
-      <w:r>
-        <w:t>)</w:t>
+      <w:r>
+        <w:t>an object’s field to a specific value.</w:t>
+      </w:r>
+      <w:r>
+        <w:t xml:space="preserve"> They alter the state of the object. The setters in the </w:t>
+      </w:r>
+      <w:r>
+        <w:t xml:space="preserve">Typist class are: </w:t>
+      </w:r>
+      <w:r>
+        <w:t>setSymbol(char newSymbol)</w:t>
       </w:r>
       <w:r>
         <w:t xml:space="preserve">, </w:t>
       </w:r>
-      <w:proofErr w:type="spellStart"/>
-      <w:proofErr w:type="gramStart"/>
-      <w:r>
-        <w:t>getSymbol</w:t>
-      </w:r>
-      <w:proofErr w:type="spellEnd"/>
-      <w:r>
-        <w:t>(</w:t>
-      </w:r>
-      <w:proofErr w:type="gramEnd"/>
-      <w:r>
-        <w:t>)</w:t>
+      <w:r>
+        <w:t>setAccuracy(double newAccuracy)</w:t>
       </w:r>
       <w:r>
         <w:t>,</w:t>
       </w:r>
       <w:r>
-        <w:t xml:space="preserve"> </w:t>
-      </w:r>
-      <w:proofErr w:type="spellStart"/>
-      <w:proofErr w:type="gramStart"/>
-      <w:r>
-        <w:t>getProgress</w:t>
-      </w:r>
-      <w:proofErr w:type="spellEnd"/>
-      <w:r>
-        <w:t>(</w:t>
-      </w:r>
-      <w:proofErr w:type="gramEnd"/>
-      <w:r>
-        <w:t>)</w:t>
+        <w:t xml:space="preserve"> typeCharacter()</w:t>
       </w:r>
       <w:r>
         <w:t>,</w:t>
       </w:r>
       <w:r>
-        <w:t xml:space="preserve"> </w:t>
-      </w:r>
-      <w:proofErr w:type="spellStart"/>
-      <w:proofErr w:type="gramStart"/>
-      <w:r>
-        <w:t>getAccuracy</w:t>
-      </w:r>
-      <w:proofErr w:type="spellEnd"/>
-      <w:r>
-        <w:t>(</w:t>
-      </w:r>
-      <w:proofErr w:type="gramEnd"/>
-      <w:r>
-        <w:t>)</w:t>
+        <w:t xml:space="preserve"> slideBack(int amount)</w:t>
       </w:r>
       <w:r>
         <w:t>,</w:t>
       </w:r>
       <w:r>
-        <w:t xml:space="preserve"> </w:t>
-      </w:r>
-      <w:proofErr w:type="spellStart"/>
-      <w:proofErr w:type="gramStart"/>
-      <w:r>
-        <w:t>getBurnoutTurnsRemaining</w:t>
-      </w:r>
-      <w:proofErr w:type="spellEnd"/>
-      <w:r>
-        <w:t>(</w:t>
-      </w:r>
-      <w:proofErr w:type="gramEnd"/>
-      <w:r>
-        <w:t>)</w:t>
+        <w:t xml:space="preserve"> burnOut(int turns)</w:t>
       </w:r>
       <w:r>
         <w:t>,</w:t>
       </w:r>
       <w:r>
-        <w:t xml:space="preserve"> </w:t>
-      </w:r>
-      <w:proofErr w:type="spellStart"/>
-      <w:proofErr w:type="gramStart"/>
-      <w:r>
-        <w:t>isBurntOut</w:t>
-      </w:r>
-      <w:proofErr w:type="spellEnd"/>
-      <w:r>
-        <w:t>(</w:t>
-      </w:r>
-      <w:proofErr w:type="gramEnd"/>
-      <w:r>
-        <w:t>)</w:t>
+        <w:t xml:space="preserve"> recoverFromBurnout()</w:t>
+      </w:r>
+      <w:r>
+        <w:t>,</w:t>
+      </w:r>
+      <w:r>
+        <w:t xml:space="preserve"> resetToStart()</w:t>
       </w:r>
       <w:r>
         <w:t>.</w:t>
@@ -375,239 +347,40 @@
     <w:p/>
     <w:p>
       <w:r>
-        <w:t>Setters</w:t>
-      </w:r>
-      <w:r>
-        <w:t>(mutators)</w:t>
-      </w:r>
-      <w:r>
-        <w:t xml:space="preserve"> are</w:t>
-      </w:r>
-      <w:r>
-        <w:t xml:space="preserve"> methods that </w:t>
-      </w:r>
-      <w:r>
-        <w:t>‘set’</w:t>
-      </w:r>
-      <w:r>
-        <w:t xml:space="preserve"> </w:t>
-      </w:r>
-      <w:r>
-        <w:t>an object’s field to a specific value.</w:t>
-      </w:r>
-      <w:r>
-        <w:t xml:space="preserve"> They alter the state of the object. The setters in the </w:t>
-      </w:r>
-      <w:r>
-        <w:t xml:space="preserve">Typist class are: </w:t>
-      </w:r>
-      <w:proofErr w:type="spellStart"/>
-      <w:proofErr w:type="gramStart"/>
-      <w:r>
-        <w:t>setSymbol</w:t>
-      </w:r>
-      <w:proofErr w:type="spellEnd"/>
-      <w:r>
-        <w:t>(</w:t>
-      </w:r>
-      <w:proofErr w:type="gramEnd"/>
-      <w:r>
-        <w:t xml:space="preserve">char </w:t>
-      </w:r>
-      <w:proofErr w:type="spellStart"/>
-      <w:r>
-        <w:t>newSymbol</w:t>
-      </w:r>
-      <w:proofErr w:type="spellEnd"/>
-      <w:r>
-        <w:t>)</w:t>
-      </w:r>
-      <w:r>
-        <w:t xml:space="preserve">, </w:t>
-      </w:r>
-      <w:proofErr w:type="spellStart"/>
-      <w:proofErr w:type="gramStart"/>
-      <w:r>
-        <w:t>setAccuracy</w:t>
-      </w:r>
-      <w:proofErr w:type="spellEnd"/>
-      <w:r>
-        <w:t>(</w:t>
-      </w:r>
-      <w:proofErr w:type="gramEnd"/>
-      <w:r>
-        <w:t xml:space="preserve">double </w:t>
-      </w:r>
-      <w:proofErr w:type="spellStart"/>
-      <w:r>
-        <w:t>newAccuracy</w:t>
-      </w:r>
-      <w:proofErr w:type="spellEnd"/>
-      <w:r>
-        <w:t>)</w:t>
-      </w:r>
-      <w:r>
-        <w:t>,</w:t>
-      </w:r>
-      <w:r>
-        <w:t xml:space="preserve"> </w:t>
-      </w:r>
-      <w:proofErr w:type="spellStart"/>
-      <w:proofErr w:type="gramStart"/>
-      <w:r>
-        <w:t>typeCharacter</w:t>
-      </w:r>
-      <w:proofErr w:type="spellEnd"/>
-      <w:r>
-        <w:t>(</w:t>
-      </w:r>
-      <w:proofErr w:type="gramEnd"/>
-      <w:r>
-        <w:t>)</w:t>
-      </w:r>
-      <w:r>
-        <w:t>,</w:t>
-      </w:r>
-      <w:r>
-        <w:t xml:space="preserve"> </w:t>
-      </w:r>
-      <w:proofErr w:type="spellStart"/>
-      <w:proofErr w:type="gramStart"/>
-      <w:r>
-        <w:t>slideBack</w:t>
-      </w:r>
-      <w:proofErr w:type="spellEnd"/>
-      <w:r>
-        <w:t>(</w:t>
-      </w:r>
-      <w:proofErr w:type="gramEnd"/>
-      <w:r>
-        <w:t>int amount)</w:t>
-      </w:r>
-      <w:r>
-        <w:t>,</w:t>
-      </w:r>
-      <w:r>
-        <w:t xml:space="preserve"> </w:t>
-      </w:r>
-      <w:proofErr w:type="spellStart"/>
-      <w:proofErr w:type="gramStart"/>
-      <w:r>
-        <w:t>burnOut</w:t>
-      </w:r>
-      <w:proofErr w:type="spellEnd"/>
-      <w:r>
-        <w:t>(</w:t>
-      </w:r>
-      <w:proofErr w:type="gramEnd"/>
-      <w:r>
-        <w:t>int turns)</w:t>
-      </w:r>
-      <w:r>
-        <w:t>,</w:t>
-      </w:r>
-      <w:r>
-        <w:t xml:space="preserve"> </w:t>
-      </w:r>
-      <w:proofErr w:type="spellStart"/>
-      <w:proofErr w:type="gramStart"/>
-      <w:r>
-        <w:t>recoverFromBurnout</w:t>
-      </w:r>
-      <w:proofErr w:type="spellEnd"/>
-      <w:r>
-        <w:t>(</w:t>
-      </w:r>
-      <w:proofErr w:type="gramEnd"/>
-      <w:r>
-        <w:t>)</w:t>
-      </w:r>
-      <w:r>
-        <w:t>,</w:t>
-      </w:r>
-      <w:r>
-        <w:t xml:space="preserve"> </w:t>
-      </w:r>
-      <w:proofErr w:type="spellStart"/>
-      <w:proofErr w:type="gramStart"/>
-      <w:r>
-        <w:t>resetToStart</w:t>
-      </w:r>
-      <w:proofErr w:type="spellEnd"/>
-      <w:r>
-        <w:t>(</w:t>
-      </w:r>
-      <w:proofErr w:type="gramEnd"/>
-      <w:r>
-        <w:t>)</w:t>
-      </w:r>
-      <w:r>
-        <w:t>.</w:t>
+        <w:t xml:space="preserve">The slideBack() method </w:t>
+      </w:r>
+      <w:r>
+        <w:t>reverses the typist’s progress if they make a mistake.</w:t>
+      </w:r>
+      <w:r>
+        <w:t xml:space="preserve"> The validation ensures that progress doesn’t become negative. I do this by </w:t>
+      </w:r>
+      <w:r>
+        <w:t xml:space="preserve">checking if progress is less than zero </w:t>
+      </w:r>
+      <w:r>
+        <w:t xml:space="preserve">after the slide-back amount has been deducted </w:t>
+      </w:r>
+      <w:r>
+        <w:t xml:space="preserve">and if it is, </w:t>
+      </w:r>
+      <w:r>
+        <w:t>I set the progress to its minimum, which is zero. This ensures that the t</w:t>
+      </w:r>
+      <w:r>
+        <w:t>ypist can’t move before the actual passage starts</w:t>
+      </w:r>
+      <w:r>
+        <w:t xml:space="preserve">, making sure all positions of the typist are valid and within the </w:t>
+      </w:r>
+      <w:r>
+        <w:t>race/passage.</w:t>
       </w:r>
     </w:p>
     <w:p/>
     <w:p>
       <w:r>
-        <w:t xml:space="preserve">The </w:t>
-      </w:r>
-      <w:proofErr w:type="spellStart"/>
-      <w:proofErr w:type="gramStart"/>
-      <w:r>
-        <w:t>slideBack</w:t>
-      </w:r>
-      <w:proofErr w:type="spellEnd"/>
-      <w:r>
-        <w:t>(</w:t>
-      </w:r>
-      <w:proofErr w:type="gramEnd"/>
-      <w:r>
-        <w:t xml:space="preserve">) method </w:t>
-      </w:r>
-      <w:r>
-        <w:t>reverses the typist’s progress if they make a mistake.</w:t>
-      </w:r>
-      <w:r>
-        <w:t xml:space="preserve"> The validation ensures that progress doesn’t become negative. I do this by </w:t>
-      </w:r>
-      <w:r>
-        <w:t xml:space="preserve">checking if progress is less than zero </w:t>
-      </w:r>
-      <w:r>
-        <w:t xml:space="preserve">after the slide-back amount has been deducted </w:t>
-      </w:r>
-      <w:r>
-        <w:t xml:space="preserve">and if it is, </w:t>
-      </w:r>
-      <w:r>
-        <w:t>I set the progress to its minimum, which is zero. This ensures that the t</w:t>
-      </w:r>
-      <w:r>
-        <w:t>ypist can’t move before the actual passage starts</w:t>
-      </w:r>
-      <w:r>
-        <w:t xml:space="preserve">, making sure all positions of the typist are valid and within the </w:t>
-      </w:r>
-      <w:r>
-        <w:t>race/passage.</w:t>
-      </w:r>
-    </w:p>
-    <w:p/>
-    <w:p>
-      <w:r>
-        <w:t xml:space="preserve">The </w:t>
-      </w:r>
-      <w:proofErr w:type="spellStart"/>
-      <w:proofErr w:type="gramStart"/>
-      <w:r>
-        <w:t>setAccuracy</w:t>
-      </w:r>
-      <w:proofErr w:type="spellEnd"/>
-      <w:r>
-        <w:t>(</w:t>
-      </w:r>
-      <w:proofErr w:type="gramEnd"/>
-      <w:r>
-        <w:t>) method modifies the typist’s accuracy rating</w:t>
+        <w:t>The setAccuracy() method modifies the typist’s accuracy rating</w:t>
       </w:r>
       <w:r>
         <w:t>, ensuring it stays between the range of 0</w:t>
@@ -758,32 +531,61 @@
           <w:u w:val="single"/>
         </w:rPr>
       </w:pPr>
-      <w:proofErr w:type="spellStart"/>
-      <w:proofErr w:type="gramStart"/>
       <w:r>
         <w:rPr>
           <w:u w:val="single"/>
         </w:rPr>
-        <w:t>typeCharacter</w:t>
-      </w:r>
-      <w:proofErr w:type="spellEnd"/>
+        <w:t>typeCharacter() Test</w:t>
+      </w:r>
       <w:r>
         <w:rPr>
           <w:u w:val="single"/>
         </w:rPr>
-        <w:t>(</w:t>
-      </w:r>
-      <w:proofErr w:type="gramEnd"/>
-      <w:r>
+        <w:t>:</w:t>
+      </w:r>
+    </w:p>
+    <w:p>
+      <w:r>
+        <w:t xml:space="preserve">I called </w:t>
+      </w:r>
+      <w:r>
+        <w:t xml:space="preserve">typeCharacter() for the object of class Typist called test 3 times, so </w:t>
+      </w:r>
+      <w:r>
+        <w:t xml:space="preserve">I printed a line that said </w:t>
+      </w:r>
+      <w:r>
+        <w:t>the progress was expected to be 3</w:t>
+      </w:r>
+      <w:r>
+        <w:t>,</w:t>
+      </w:r>
+      <w:r>
+        <w:t xml:space="preserve"> since the typist advanced 3 characters.</w:t>
+      </w:r>
+      <w:r>
+        <w:t xml:space="preserve"> </w:t>
+      </w:r>
+      <w:r>
+        <w:t>The test also confirmed the progress was 3 so typeCharacter() moves forward normally.</w:t>
+      </w:r>
+    </w:p>
+    <w:p>
+      <w:pPr>
         <w:rPr>
           <w:u w:val="single"/>
         </w:rPr>
-        <w:t>) Test</w:t>
-      </w:r>
+      </w:pPr>
       <w:r>
         <w:rPr>
           <w:u w:val="single"/>
         </w:rPr>
+        <w:t>slideBack() Test</w:t>
+      </w:r>
+      <w:r>
+        <w:rPr>
+          <w:u w:val="single"/>
+        </w:rPr>
         <w:t>:</w:t>
       </w:r>
     </w:p>
@@ -791,515 +593,337 @@
       <w:r>
         <w:t xml:space="preserve">I called </w:t>
       </w:r>
-      <w:proofErr w:type="spellStart"/>
-      <w:proofErr w:type="gramStart"/>
-      <w:r>
-        <w:t>typeCharacter</w:t>
-      </w:r>
-      <w:proofErr w:type="spellEnd"/>
-      <w:r>
-        <w:t>(</w:t>
-      </w:r>
-      <w:proofErr w:type="gramEnd"/>
-      <w:r>
-        <w:t xml:space="preserve">) for the object of class Typist called test 3 times, so </w:t>
-      </w:r>
-      <w:r>
-        <w:t xml:space="preserve">I printed a line that said </w:t>
-      </w:r>
-      <w:r>
-        <w:t>the progress was expected to be 3</w:t>
+      <w:r>
+        <w:t>slideBack</w:t>
+      </w:r>
+      <w:r>
+        <w:t xml:space="preserve">() for the </w:t>
+      </w:r>
+      <w:r>
+        <w:t xml:space="preserve">same </w:t>
+      </w:r>
+      <w:r>
+        <w:t>object of class Typist called test</w:t>
+      </w:r>
+      <w:r>
+        <w:t>, with</w:t>
+      </w:r>
+      <w:r>
+        <w:t xml:space="preserve"> the parameter of the integer 5 for the amount,</w:t>
+      </w:r>
+      <w:r>
+        <w:t xml:space="preserve"> but since the progress can’t be negative as explained before (otherwise it would’ve been -2), the progress was ou</w:t>
+      </w:r>
+      <w:r>
+        <w:t>t</w:t>
+      </w:r>
+      <w:r>
+        <w:t>putted as zero</w:t>
+      </w:r>
+      <w:r>
+        <w:t xml:space="preserve"> (matching the line I printed to say the </w:t>
+      </w:r>
+      <w:r>
+        <w:t>progress should be 0</w:t>
+      </w:r>
+      <w:r>
+        <w:t>)</w:t>
+      </w:r>
+      <w:r>
+        <w:t>, confirming the progress can’t go below zero after calling slideBack().</w:t>
+      </w:r>
+    </w:p>
+    <w:p>
+      <w:pPr>
+        <w:rPr>
+          <w:u w:val="single"/>
+        </w:rPr>
+      </w:pPr>
+    </w:p>
+    <w:p>
+      <w:pPr>
+        <w:rPr>
+          <w:u w:val="single"/>
+        </w:rPr>
+      </w:pPr>
+      <w:r>
+        <w:rPr>
+          <w:u w:val="single"/>
+        </w:rPr>
+        <w:t>burnout()</w:t>
+      </w:r>
+      <w:r>
+        <w:rPr>
+          <w:u w:val="single"/>
+        </w:rPr>
+        <w:t xml:space="preserve"> Test</w:t>
+      </w:r>
+      <w:r>
+        <w:rPr>
+          <w:u w:val="single"/>
+        </w:rPr>
+        <w:t>:</w:t>
+      </w:r>
+    </w:p>
+    <w:p>
+      <w:pPr>
+        <w:rPr>
+          <w:u w:val="single"/>
+        </w:rPr>
+      </w:pPr>
+      <w:r>
+        <w:t xml:space="preserve">I called </w:t>
+      </w:r>
+      <w:r>
+        <w:t>burnOut</w:t>
+      </w:r>
+      <w:r>
+        <w:t xml:space="preserve">() for the </w:t>
+      </w:r>
+      <w:r>
+        <w:t xml:space="preserve">same </w:t>
+      </w:r>
+      <w:r>
+        <w:t>object of class Typist called test</w:t>
+      </w:r>
+      <w:r>
+        <w:t>, with the parameter of the integer 3 for the turns.</w:t>
+      </w:r>
+      <w:r>
+        <w:t xml:space="preserve"> The expected behaviour was that the Boolean burntOut should be assigned the value of true and the burnoutTurnsRemaining should be equal to the parameter turns inputted.</w:t>
+      </w:r>
+      <w:r>
+        <w:t xml:space="preserve"> </w:t>
+      </w:r>
+      <w:r>
+        <w:t xml:space="preserve">The </w:t>
+      </w:r>
+      <w:r>
+        <w:t xml:space="preserve">burnout Boolean was outputted as true and the burnoutTurnsRemaining mirrored the integer inputted, matching expectations. </w:t>
+      </w:r>
+    </w:p>
+    <w:p>
+      <w:pPr>
+        <w:rPr>
+          <w:u w:val="single"/>
+        </w:rPr>
+      </w:pPr>
+      <w:r>
+        <w:rPr>
+          <w:u w:val="single"/>
+        </w:rPr>
+        <w:t>set</w:t>
+      </w:r>
+      <w:r>
+        <w:rPr>
+          <w:u w:val="single"/>
+        </w:rPr>
+        <w:t>Accuracy</w:t>
+      </w:r>
+      <w:r>
+        <w:rPr>
+          <w:u w:val="single"/>
+        </w:rPr>
+        <w:t>()</w:t>
+      </w:r>
+      <w:r>
+        <w:rPr>
+          <w:u w:val="single"/>
+        </w:rPr>
+        <w:t xml:space="preserve"> T</w:t>
+      </w:r>
+      <w:r>
+        <w:rPr>
+          <w:u w:val="single"/>
+        </w:rPr>
+        <w:t>est:</w:t>
+      </w:r>
+    </w:p>
+    <w:p>
+      <w:pPr>
+        <w:rPr>
+          <w:u w:val="single"/>
+        </w:rPr>
+      </w:pPr>
+      <w:r>
+        <w:t xml:space="preserve">I called </w:t>
+      </w:r>
+      <w:r>
+        <w:t>setAccuracy</w:t>
+      </w:r>
+      <w:r>
+        <w:t xml:space="preserve">() for the </w:t>
+      </w:r>
+      <w:r>
+        <w:t xml:space="preserve">same </w:t>
+      </w:r>
+      <w:r>
+        <w:t>object of class Typist called test</w:t>
+      </w:r>
+      <w:r>
+        <w:t>, with the parameter of the double</w:t>
+      </w:r>
+      <w:r>
+        <w:t>s</w:t>
+      </w:r>
+      <w:r>
+        <w:t xml:space="preserve"> </w:t>
+      </w:r>
+      <w:r>
+        <w:t>1.2, -0.7 and 0.5</w:t>
+      </w:r>
+      <w:r>
+        <w:t xml:space="preserve"> for the </w:t>
+      </w:r>
+      <w:r>
+        <w:t xml:space="preserve">accuracy rating. </w:t>
+      </w:r>
+      <w:r>
+        <w:t xml:space="preserve">The expected results </w:t>
+      </w:r>
+      <w:r>
+        <w:t>were that</w:t>
+      </w:r>
+      <w:r>
+        <w:t xml:space="preserve"> the accuracy rating stays between the range of 0.0 and 1.0. If the </w:t>
+      </w:r>
+      <w:r>
+        <w:t>accuracy rating</w:t>
+      </w:r>
+      <w:r>
+        <w:t xml:space="preserve"> is below zero</w:t>
+      </w:r>
+      <w:r>
+        <w:t xml:space="preserve"> (-0.7)</w:t>
+      </w:r>
+      <w:r>
+        <w:t xml:space="preserve">, </w:t>
+      </w:r>
+      <w:r>
+        <w:t xml:space="preserve">it </w:t>
+      </w:r>
+      <w:r>
+        <w:t xml:space="preserve">is set to zero. </w:t>
+      </w:r>
+      <w:r>
+        <w:t>If</w:t>
+      </w:r>
+      <w:r>
+        <w:t xml:space="preserve"> it’s above one</w:t>
+      </w:r>
+      <w:r>
+        <w:t xml:space="preserve"> (1.2)</w:t>
+      </w:r>
+      <w:r>
+        <w:t>, the accuracy rating is set to one. Valid values</w:t>
+      </w:r>
+      <w:r>
+        <w:t xml:space="preserve"> (0.5)</w:t>
+      </w:r>
+      <w:r>
+        <w:t xml:space="preserve"> are </w:t>
+      </w:r>
+      <w:r>
+        <w:t>unchanged.</w:t>
+      </w:r>
+    </w:p>
+    <w:p>
+      <w:pPr>
+        <w:rPr>
+          <w:u w:val="single"/>
+        </w:rPr>
+      </w:pPr>
+      <w:r>
+        <w:rPr>
+          <w:u w:val="single"/>
+        </w:rPr>
+        <w:t>resetToStart() Test</w:t>
+      </w:r>
+      <w:r>
+        <w:rPr>
+          <w:u w:val="single"/>
+        </w:rPr>
+        <w:t>:</w:t>
+      </w:r>
+    </w:p>
+    <w:p>
+      <w:pPr>
+        <w:rPr>
+          <w:u w:val="single"/>
+        </w:rPr>
+      </w:pPr>
+      <w:r>
+        <w:t xml:space="preserve">I called </w:t>
+      </w:r>
+      <w:r>
+        <w:t>resetToStart</w:t>
+      </w:r>
+      <w:r>
+        <w:t xml:space="preserve">() for the </w:t>
+      </w:r>
+      <w:r>
+        <w:t xml:space="preserve">same </w:t>
+      </w:r>
+      <w:r>
+        <w:t>object of class Typist called test</w:t>
+      </w:r>
+      <w:r>
+        <w:t xml:space="preserve">. </w:t>
+      </w:r>
+      <w:r>
+        <w:t xml:space="preserve">The expected behaviour </w:t>
+      </w:r>
+      <w:r>
+        <w:t>after</w:t>
+      </w:r>
+      <w:r>
+        <w:t xml:space="preserve"> the reset</w:t>
+      </w:r>
+      <w:r>
+        <w:t xml:space="preserve"> was</w:t>
       </w:r>
       <w:r>
         <w:t>,</w:t>
       </w:r>
       <w:r>
-        <w:t xml:space="preserve"> since the typist advanced 3 characters.</w:t>
-      </w:r>
-      <w:r>
-        <w:t xml:space="preserve"> </w:t>
-      </w:r>
-      <w:r>
-        <w:t xml:space="preserve">The test also confirmed the progress was 3 so </w:t>
-      </w:r>
-      <w:proofErr w:type="spellStart"/>
-      <w:proofErr w:type="gramStart"/>
-      <w:r>
-        <w:t>typeCharacter</w:t>
-      </w:r>
-      <w:proofErr w:type="spellEnd"/>
-      <w:r>
-        <w:t>(</w:t>
-      </w:r>
-      <w:proofErr w:type="gramEnd"/>
-      <w:r>
-        <w:t>) moves forward normally.</w:t>
-      </w:r>
-    </w:p>
-    <w:p>
-      <w:pPr>
-        <w:rPr>
-          <w:u w:val="single"/>
-        </w:rPr>
-      </w:pPr>
-      <w:proofErr w:type="spellStart"/>
-      <w:proofErr w:type="gramStart"/>
-      <w:r>
-        <w:rPr>
-          <w:u w:val="single"/>
-        </w:rPr>
-        <w:t>slideBack</w:t>
-      </w:r>
-      <w:proofErr w:type="spellEnd"/>
-      <w:r>
-        <w:rPr>
-          <w:u w:val="single"/>
-        </w:rPr>
-        <w:t>(</w:t>
-      </w:r>
-      <w:proofErr w:type="gramEnd"/>
-      <w:r>
-        <w:rPr>
-          <w:u w:val="single"/>
-        </w:rPr>
-        <w:t>) Test</w:t>
-      </w:r>
-      <w:r>
-        <w:rPr>
-          <w:u w:val="single"/>
-        </w:rPr>
-        <w:t>:</w:t>
-      </w:r>
-    </w:p>
-    <w:p>
-      <w:r>
-        <w:t xml:space="preserve">I called </w:t>
-      </w:r>
-      <w:proofErr w:type="spellStart"/>
-      <w:r>
-        <w:t>slideBack</w:t>
-      </w:r>
-      <w:proofErr w:type="spellEnd"/>
-      <w:r>
-        <w:t xml:space="preserve">() for the </w:t>
-      </w:r>
-      <w:r>
-        <w:t xml:space="preserve">same </w:t>
-      </w:r>
-      <w:r>
-        <w:t>object of class Typist called test</w:t>
-      </w:r>
-      <w:r>
-        <w:t>, with</w:t>
-      </w:r>
-      <w:r>
-        <w:t xml:space="preserve"> the parameter of the integer 5 for the amount,</w:t>
-      </w:r>
-      <w:r>
-        <w:t xml:space="preserve"> but since the progress can’t be negative as explained before (otherwise it would’ve been -2), the progress was ou</w:t>
-      </w:r>
-      <w:r>
-        <w:t>t</w:t>
-      </w:r>
-      <w:r>
-        <w:t>putted as zero</w:t>
-      </w:r>
-      <w:r>
-        <w:t xml:space="preserve"> (matching the line I printed to say the </w:t>
-      </w:r>
-      <w:r>
-        <w:t>progress should be 0</w:t>
-      </w:r>
-      <w:r>
-        <w:t>)</w:t>
-      </w:r>
-      <w:r>
-        <w:t xml:space="preserve">, confirming the progress can’t go below zero after calling </w:t>
-      </w:r>
-      <w:proofErr w:type="spellStart"/>
-      <w:r>
-        <w:t>slideBack</w:t>
-      </w:r>
-      <w:proofErr w:type="spellEnd"/>
-      <w:r>
-        <w:t>().</w:t>
-      </w:r>
-    </w:p>
-    <w:p>
-      <w:pPr>
-        <w:rPr>
-          <w:u w:val="single"/>
-        </w:rPr>
-      </w:pPr>
-    </w:p>
-    <w:p>
-      <w:pPr>
-        <w:rPr>
-          <w:u w:val="single"/>
-        </w:rPr>
-      </w:pPr>
-      <w:proofErr w:type="gramStart"/>
-      <w:r>
-        <w:rPr>
-          <w:u w:val="single"/>
-        </w:rPr>
-        <w:t>burnout(</w:t>
-      </w:r>
-      <w:proofErr w:type="gramEnd"/>
-      <w:r>
-        <w:rPr>
-          <w:u w:val="single"/>
-        </w:rPr>
-        <w:t>)</w:t>
-      </w:r>
-      <w:r>
-        <w:rPr>
-          <w:u w:val="single"/>
-        </w:rPr>
-        <w:t xml:space="preserve"> Test</w:t>
-      </w:r>
-      <w:r>
-        <w:rPr>
-          <w:u w:val="single"/>
-        </w:rPr>
-        <w:t>:</w:t>
-      </w:r>
-    </w:p>
-    <w:p>
-      <w:pPr>
-        <w:rPr>
-          <w:u w:val="single"/>
-        </w:rPr>
-      </w:pPr>
-      <w:r>
-        <w:t xml:space="preserve">I called </w:t>
-      </w:r>
-      <w:proofErr w:type="spellStart"/>
-      <w:proofErr w:type="gramStart"/>
-      <w:r>
-        <w:t>burnOut</w:t>
-      </w:r>
-      <w:proofErr w:type="spellEnd"/>
-      <w:r>
-        <w:t>(</w:t>
-      </w:r>
-      <w:proofErr w:type="gramEnd"/>
-      <w:r>
-        <w:t xml:space="preserve">) for the </w:t>
-      </w:r>
-      <w:r>
-        <w:t xml:space="preserve">same </w:t>
-      </w:r>
-      <w:r>
-        <w:t>object of class Typist called test</w:t>
-      </w:r>
-      <w:r>
-        <w:t>, with the parameter of the integer 3 for the turns.</w:t>
-      </w:r>
-      <w:r>
-        <w:t xml:space="preserve"> The expected behaviour was that the Boolean </w:t>
-      </w:r>
-      <w:proofErr w:type="spellStart"/>
-      <w:r>
-        <w:t>burntOut</w:t>
-      </w:r>
-      <w:proofErr w:type="spellEnd"/>
-      <w:r>
-        <w:t xml:space="preserve"> should be assigned the value of true and the </w:t>
-      </w:r>
-      <w:proofErr w:type="spellStart"/>
-      <w:r>
-        <w:t>burnoutTurnsRemaining</w:t>
-      </w:r>
-      <w:proofErr w:type="spellEnd"/>
-      <w:r>
-        <w:t xml:space="preserve"> should be equal to the parameter turns inputted.</w:t>
-      </w:r>
-      <w:r>
-        <w:t xml:space="preserve"> </w:t>
-      </w:r>
-      <w:r>
-        <w:t xml:space="preserve">The </w:t>
-      </w:r>
-      <w:r>
-        <w:t xml:space="preserve">burnout Boolean was outputted as true and the </w:t>
-      </w:r>
-      <w:proofErr w:type="spellStart"/>
-      <w:r>
-        <w:t>burnoutTurnsRemaining</w:t>
-      </w:r>
-      <w:proofErr w:type="spellEnd"/>
-      <w:r>
-        <w:t xml:space="preserve"> mirrored the integer inputted, matching expectations. </w:t>
-      </w:r>
-    </w:p>
-    <w:p>
-      <w:pPr>
-        <w:rPr>
-          <w:u w:val="single"/>
-        </w:rPr>
-      </w:pPr>
-      <w:proofErr w:type="spellStart"/>
-      <w:proofErr w:type="gramStart"/>
-      <w:r>
-        <w:rPr>
-          <w:u w:val="single"/>
-        </w:rPr>
-        <w:t>set</w:t>
-      </w:r>
-      <w:r>
-        <w:rPr>
-          <w:u w:val="single"/>
-        </w:rPr>
-        <w:t>Accuracy</w:t>
-      </w:r>
-      <w:proofErr w:type="spellEnd"/>
-      <w:r>
-        <w:rPr>
-          <w:u w:val="single"/>
-        </w:rPr>
-        <w:t>(</w:t>
-      </w:r>
-      <w:proofErr w:type="gramEnd"/>
-      <w:r>
-        <w:rPr>
-          <w:u w:val="single"/>
-        </w:rPr>
-        <w:t>)</w:t>
-      </w:r>
-      <w:r>
-        <w:rPr>
-          <w:u w:val="single"/>
-        </w:rPr>
-        <w:t xml:space="preserve"> T</w:t>
-      </w:r>
-      <w:r>
-        <w:rPr>
-          <w:u w:val="single"/>
-        </w:rPr>
-        <w:t>est:</w:t>
-      </w:r>
-    </w:p>
-    <w:p>
-      <w:pPr>
-        <w:rPr>
-          <w:u w:val="single"/>
-        </w:rPr>
-      </w:pPr>
-      <w:r>
-        <w:t xml:space="preserve">I called </w:t>
-      </w:r>
-      <w:proofErr w:type="spellStart"/>
-      <w:proofErr w:type="gramStart"/>
-      <w:r>
-        <w:t>setAccuracy</w:t>
-      </w:r>
-      <w:proofErr w:type="spellEnd"/>
-      <w:r>
-        <w:t>(</w:t>
-      </w:r>
-      <w:proofErr w:type="gramEnd"/>
-      <w:r>
-        <w:t xml:space="preserve">) for the </w:t>
-      </w:r>
-      <w:r>
-        <w:t xml:space="preserve">same </w:t>
-      </w:r>
-      <w:r>
-        <w:t>object of class Typist called test</w:t>
-      </w:r>
-      <w:r>
-        <w:t>, with the parameter of the double</w:t>
-      </w:r>
-      <w:r>
-        <w:t>s</w:t>
-      </w:r>
-      <w:r>
-        <w:t xml:space="preserve"> </w:t>
-      </w:r>
-      <w:r>
-        <w:t>1.2, -0.7 and 0.5</w:t>
-      </w:r>
-      <w:r>
-        <w:t xml:space="preserve"> for the </w:t>
-      </w:r>
-      <w:r>
-        <w:t xml:space="preserve">accuracy rating. </w:t>
-      </w:r>
-      <w:r>
-        <w:t xml:space="preserve">The expected results </w:t>
-      </w:r>
-      <w:r>
-        <w:t>were that</w:t>
-      </w:r>
-      <w:r>
-        <w:t xml:space="preserve"> the accuracy rating stays between the range of 0.0 and 1.0. If the </w:t>
-      </w:r>
-      <w:r>
-        <w:t>accuracy rating</w:t>
-      </w:r>
-      <w:r>
-        <w:t xml:space="preserve"> is below zero</w:t>
-      </w:r>
-      <w:r>
-        <w:t xml:space="preserve"> (-0.7)</w:t>
-      </w:r>
-      <w:r>
-        <w:t xml:space="preserve">, </w:t>
-      </w:r>
-      <w:r>
-        <w:t xml:space="preserve">it </w:t>
-      </w:r>
-      <w:r>
-        <w:t xml:space="preserve">is set to zero. </w:t>
-      </w:r>
-      <w:r>
-        <w:t>If</w:t>
-      </w:r>
-      <w:r>
-        <w:t xml:space="preserve"> it’s above one</w:t>
-      </w:r>
-      <w:r>
-        <w:t xml:space="preserve"> (1.2)</w:t>
-      </w:r>
-      <w:r>
-        <w:t>, the accuracy rating is set to one. Valid values</w:t>
-      </w:r>
-      <w:r>
-        <w:t xml:space="preserve"> (0.5)</w:t>
-      </w:r>
-      <w:r>
-        <w:t xml:space="preserve"> are </w:t>
-      </w:r>
-      <w:r>
-        <w:t>unchanged.</w:t>
-      </w:r>
-    </w:p>
-    <w:p>
-      <w:pPr>
-        <w:rPr>
-          <w:u w:val="single"/>
-        </w:rPr>
-      </w:pPr>
-      <w:proofErr w:type="spellStart"/>
-      <w:proofErr w:type="gramStart"/>
-      <w:r>
-        <w:rPr>
-          <w:u w:val="single"/>
-        </w:rPr>
-        <w:t>resetToStart</w:t>
-      </w:r>
-      <w:proofErr w:type="spellEnd"/>
-      <w:r>
-        <w:rPr>
-          <w:u w:val="single"/>
-        </w:rPr>
-        <w:t>(</w:t>
-      </w:r>
-      <w:proofErr w:type="gramEnd"/>
-      <w:r>
-        <w:rPr>
-          <w:u w:val="single"/>
-        </w:rPr>
-        <w:t>) Test</w:t>
-      </w:r>
-      <w:r>
-        <w:rPr>
-          <w:u w:val="single"/>
-        </w:rPr>
-        <w:t>:</w:t>
-      </w:r>
-    </w:p>
-    <w:p>
-      <w:pPr>
-        <w:rPr>
-          <w:u w:val="single"/>
-        </w:rPr>
-      </w:pPr>
-      <w:r>
-        <w:t xml:space="preserve">I called </w:t>
-      </w:r>
-      <w:proofErr w:type="spellStart"/>
-      <w:proofErr w:type="gramStart"/>
-      <w:r>
-        <w:t>resetToStart</w:t>
-      </w:r>
-      <w:proofErr w:type="spellEnd"/>
-      <w:r>
-        <w:t>(</w:t>
-      </w:r>
-      <w:proofErr w:type="gramEnd"/>
-      <w:r>
-        <w:t xml:space="preserve">) for the </w:t>
-      </w:r>
-      <w:r>
-        <w:t xml:space="preserve">same </w:t>
-      </w:r>
-      <w:r>
-        <w:t>object of class Typist called test</w:t>
-      </w:r>
-      <w:r>
-        <w:t xml:space="preserve">. </w:t>
-      </w:r>
-      <w:r>
-        <w:t xml:space="preserve">The expected behaviour </w:t>
-      </w:r>
-      <w:r>
-        <w:t>after</w:t>
-      </w:r>
-      <w:r>
-        <w:t xml:space="preserve"> the reset</w:t>
-      </w:r>
-      <w:r>
-        <w:t xml:space="preserve"> was</w:t>
+        <w:t xml:space="preserve"> the progress should be set to 0</w:t>
       </w:r>
       <w:r>
         <w:t>,</w:t>
       </w:r>
       <w:r>
-        <w:t xml:space="preserve"> the progress should be set to 0</w:t>
+        <w:t xml:space="preserve"> the typist should not be burnt out and </w:t>
+      </w:r>
+      <w:r>
+        <w:t xml:space="preserve">thus, </w:t>
+      </w:r>
+      <w:r>
+        <w:t>the burnout turns remaining should be 0</w:t>
+      </w:r>
+      <w:r>
+        <w:t>.</w:t>
+      </w:r>
+      <w:r>
+        <w:t xml:space="preserve"> The output</w:t>
+      </w:r>
+      <w:r>
+        <w:t>s were</w:t>
+      </w:r>
+      <w:r>
+        <w:t xml:space="preserve">: </w:t>
+      </w:r>
+      <w:r>
+        <w:t>the current progress is 0</w:t>
       </w:r>
       <w:r>
         <w:t>,</w:t>
       </w:r>
       <w:r>
-        <w:t xml:space="preserve"> the typist should not be burnt out and </w:t>
-      </w:r>
-      <w:r>
-        <w:t xml:space="preserve">thus, </w:t>
-      </w:r>
-      <w:r>
-        <w:t>the burnout turns remaining should be 0</w:t>
-      </w:r>
-      <w:r>
-        <w:t>.</w:t>
-      </w:r>
-      <w:r>
-        <w:t xml:space="preserve"> The output</w:t>
-      </w:r>
-      <w:r>
-        <w:t>s were</w:t>
-      </w:r>
-      <w:r>
-        <w:t xml:space="preserve">: </w:t>
-      </w:r>
-      <w:r>
-        <w:t>the current progress is 0</w:t>
-      </w:r>
-      <w:r>
-        <w:t>,</w:t>
-      </w:r>
-      <w:r>
         <w:t xml:space="preserve"> the </w:t>
       </w:r>
       <w:r>
-        <w:t xml:space="preserve">Boolean </w:t>
-      </w:r>
-      <w:proofErr w:type="spellStart"/>
-      <w:r>
-        <w:t>isBurntOut</w:t>
-      </w:r>
-      <w:proofErr w:type="spellEnd"/>
+        <w:t>Boolean isBurntOut</w:t>
+      </w:r>
       <w:r>
         <w:t xml:space="preserve"> return</w:t>
       </w:r>
@@ -1356,7 +980,6 @@
           <w:u w:val="single"/>
         </w:rPr>
       </w:pPr>
-      <w:proofErr w:type="spellStart"/>
       <w:r>
         <w:rPr>
           <w:b/>
@@ -1365,18 +988,7 @@
           <w:szCs w:val="28"/>
           <w:u w:val="single"/>
         </w:rPr>
-        <w:t>TypingRace</w:t>
-      </w:r>
-      <w:proofErr w:type="spellEnd"/>
-      <w:r>
-        <w:rPr>
-          <w:b/>
-          <w:bCs/>
-          <w:sz w:val="28"/>
-          <w:szCs w:val="28"/>
-          <w:u w:val="single"/>
-        </w:rPr>
-        <w:t xml:space="preserve"> Class Report:</w:t>
+        <w:t>TypingRace Class Report:</w:t>
       </w:r>
     </w:p>
     <w:p>
@@ -1390,15 +1002,7 @@
         <w:t>ing</w:t>
       </w:r>
       <w:r>
-        <w:t xml:space="preserve"> through the original </w:t>
-      </w:r>
-      <w:proofErr w:type="spellStart"/>
-      <w:r>
-        <w:t>TypingRace</w:t>
-      </w:r>
-      <w:proofErr w:type="spellEnd"/>
-      <w:r>
-        <w:t xml:space="preserve"> code</w:t>
+        <w:t xml:space="preserve"> through the original TypingRace code</w:t>
       </w:r>
       <w:r>
         <w:t>, I</w:t>
@@ -1449,33 +1053,7 @@
         <w:t xml:space="preserve">ve had </w:t>
       </w:r>
       <w:r>
-        <w:t xml:space="preserve">leftover progress or burnout from a previous race. I fixed this in </w:t>
-      </w:r>
-      <w:proofErr w:type="spellStart"/>
-      <w:proofErr w:type="gramStart"/>
-      <w:r>
-        <w:t>startRace</w:t>
-      </w:r>
-      <w:proofErr w:type="spellEnd"/>
-      <w:r>
-        <w:t>(</w:t>
-      </w:r>
-      <w:proofErr w:type="gramEnd"/>
-      <w:r>
-        <w:t xml:space="preserve">) by calling </w:t>
-      </w:r>
-      <w:proofErr w:type="spellStart"/>
-      <w:proofErr w:type="gramStart"/>
-      <w:r>
-        <w:t>resetToStart</w:t>
-      </w:r>
-      <w:proofErr w:type="spellEnd"/>
-      <w:r>
-        <w:t>(</w:t>
-      </w:r>
-      <w:proofErr w:type="gramEnd"/>
-      <w:r>
-        <w:t xml:space="preserve">) for </w:t>
+        <w:t xml:space="preserve">leftover progress or burnout from a previous race. I fixed this in startRace() by calling resetToStart() for </w:t>
       </w:r>
       <w:r>
         <w:t>s</w:t>
@@ -1518,67 +1096,7 @@
         <w:t>, it was</w:t>
       </w:r>
       <w:r>
-        <w:t xml:space="preserve"> assumed all three seats always had a typist. If a seat was empty, this could cause a </w:t>
-      </w:r>
-      <w:proofErr w:type="spellStart"/>
-      <w:r>
-        <w:t>NullPointerException</w:t>
-      </w:r>
-      <w:proofErr w:type="spellEnd"/>
-      <w:r>
-        <w:t xml:space="preserve"> crash when methods like </w:t>
-      </w:r>
-      <w:proofErr w:type="spellStart"/>
-      <w:proofErr w:type="gramStart"/>
-      <w:r>
-        <w:t>resetToStart</w:t>
-      </w:r>
-      <w:proofErr w:type="spellEnd"/>
-      <w:r>
-        <w:t>(</w:t>
-      </w:r>
-      <w:proofErr w:type="gramEnd"/>
-      <w:r>
-        <w:t xml:space="preserve">), </w:t>
-      </w:r>
-      <w:proofErr w:type="spellStart"/>
-      <w:proofErr w:type="gramStart"/>
-      <w:r>
-        <w:t>advanceTypist</w:t>
-      </w:r>
-      <w:proofErr w:type="spellEnd"/>
-      <w:r>
-        <w:t>(</w:t>
-      </w:r>
-      <w:proofErr w:type="gramEnd"/>
-      <w:r>
-        <w:t xml:space="preserve">), </w:t>
-      </w:r>
-      <w:proofErr w:type="spellStart"/>
-      <w:proofErr w:type="gramStart"/>
-      <w:r>
-        <w:t>raceFinishedBy</w:t>
-      </w:r>
-      <w:proofErr w:type="spellEnd"/>
-      <w:r>
-        <w:t>(</w:t>
-      </w:r>
-      <w:proofErr w:type="gramEnd"/>
-      <w:r>
-        <w:t xml:space="preserve">), or </w:t>
-      </w:r>
-      <w:proofErr w:type="spellStart"/>
-      <w:proofErr w:type="gramStart"/>
-      <w:r>
-        <w:t>printSeat</w:t>
-      </w:r>
-      <w:proofErr w:type="spellEnd"/>
-      <w:r>
-        <w:t>(</w:t>
-      </w:r>
-      <w:proofErr w:type="gramEnd"/>
-      <w:r>
-        <w:t>) were called. I fixed this by checking whether the typist is null before using it. The correct implementation should ignore empty seats instead of crashing.</w:t>
+        <w:t xml:space="preserve"> assumed all three seats always had a typist. If a seat was empty, this could cause a NullPointerException crash when methods like resetToStart(), advanceTypist(), raceFinishedBy(), or printSeat() were called. I fixed this by checking whether the typist is null before using it. The correct implementation should ignore empty seats instead of crashing.</w:t>
       </w:r>
       <w:r>
         <w:t xml:space="preserve"> </w:t>
@@ -1589,15 +1107,7 @@
         <w:t xml:space="preserve">Code: </w:t>
       </w:r>
       <w:r>
-        <w:t>if (seat1</w:t>
-      </w:r>
-      <w:proofErr w:type="gramStart"/>
-      <w:r>
-        <w:t>Typist !</w:t>
-      </w:r>
-      <w:proofErr w:type="gramEnd"/>
-      <w:r>
-        <w:t>= null) {</w:t>
+        <w:t>if (seat1Typist != null) {</w:t>
       </w:r>
     </w:p>
     <w:p>
@@ -1612,15 +1122,7 @@
     </w:p>
     <w:p>
       <w:r>
-        <w:t>        if (seat2</w:t>
-      </w:r>
-      <w:proofErr w:type="gramStart"/>
-      <w:r>
-        <w:t>Typist !</w:t>
-      </w:r>
-      <w:proofErr w:type="gramEnd"/>
-      <w:r>
-        <w:t>= null) {</w:t>
+        <w:t>        if (seat2Typist != null) {</w:t>
       </w:r>
     </w:p>
     <w:p>
@@ -1635,15 +1137,7 @@
     </w:p>
     <w:p>
       <w:r>
-        <w:t>        if (seat3</w:t>
-      </w:r>
-      <w:proofErr w:type="gramStart"/>
-      <w:r>
-        <w:t>Typist !</w:t>
-      </w:r>
-      <w:proofErr w:type="gramEnd"/>
-      <w:r>
-        <w:t>= null) {</w:t>
+        <w:t>        if (seat3Typist != null) {</w:t>
       </w:r>
     </w:p>
     <w:p>
@@ -1665,20 +1159,7 @@
         <w:t xml:space="preserve"> third problem</w:t>
       </w:r>
       <w:r>
-        <w:t xml:space="preserve"> was with the mistype probability in </w:t>
-      </w:r>
-      <w:proofErr w:type="spellStart"/>
-      <w:proofErr w:type="gramStart"/>
-      <w:r>
-        <w:t>advanceTypist</w:t>
-      </w:r>
-      <w:proofErr w:type="spellEnd"/>
-      <w:r>
-        <w:t>(</w:t>
-      </w:r>
-      <w:proofErr w:type="gramEnd"/>
-      <w:r>
-        <w:t xml:space="preserve">). </w:t>
+        <w:t xml:space="preserve"> was with the mistype probability in advanceTypist(). </w:t>
       </w:r>
       <w:r>
         <w:t>Originally,</w:t>
@@ -1728,50 +1209,13 @@
         <w:t xml:space="preserve">Code: </w:t>
       </w:r>
       <w:r>
-        <w:t>if (</w:t>
-      </w:r>
-      <w:proofErr w:type="spellStart"/>
-      <w:r>
-        <w:t>Math.random</w:t>
-      </w:r>
-      <w:proofErr w:type="spellEnd"/>
-      <w:r>
-        <w:t xml:space="preserve">() &lt; (1 - </w:t>
-      </w:r>
-      <w:proofErr w:type="spellStart"/>
-      <w:r>
-        <w:t>theTypist.getAccuracy</w:t>
-      </w:r>
-      <w:proofErr w:type="spellEnd"/>
-      <w:r>
-        <w:t>())</w:t>
+        <w:t>if (Math.random() &lt; (1 - theTypist.getAccuracy())</w:t>
       </w:r>
     </w:p>
     <w:p/>
     <w:p>
       <w:r>
-        <w:t xml:space="preserve">The race finish condition in </w:t>
-      </w:r>
-      <w:proofErr w:type="spellStart"/>
-      <w:proofErr w:type="gramStart"/>
-      <w:r>
-        <w:t>raceFinishedBy</w:t>
-      </w:r>
-      <w:proofErr w:type="spellEnd"/>
-      <w:r>
-        <w:t>(</w:t>
-      </w:r>
-      <w:proofErr w:type="gramEnd"/>
-      <w:r>
-        <w:t xml:space="preserve">) was also incorrect. The original code checked whether progress was exactly equal to </w:t>
-      </w:r>
-      <w:proofErr w:type="spellStart"/>
-      <w:r>
-        <w:t>passageLength</w:t>
-      </w:r>
-      <w:proofErr w:type="spellEnd"/>
-      <w:r>
-        <w:t xml:space="preserve">. This </w:t>
+        <w:t xml:space="preserve">The race finish condition in raceFinishedBy() was also incorrect. The original code checked whether progress was exactly equal to passageLength. This </w:t>
       </w:r>
       <w:r>
         <w:t>is</w:t>
@@ -1785,21 +1229,8 @@
         <w:t xml:space="preserve">Code: </w:t>
       </w:r>
       <w:r>
-        <w:t>if (</w:t>
-      </w:r>
-      <w:proofErr w:type="spellStart"/>
-      <w:r>
-        <w:t>theTypist.getProgress</w:t>
-      </w:r>
-      <w:proofErr w:type="spellEnd"/>
-      <w:r>
-        <w:t xml:space="preserve">() &gt;= </w:t>
-      </w:r>
-      <w:proofErr w:type="spellStart"/>
-      <w:r>
-        <w:t>passageLength</w:t>
-      </w:r>
-      <w:proofErr w:type="spellEnd"/>
+        <w:t>if (theTypist.getProgress() &gt;= passageLength</w:t>
+      </w:r>
       <w:r>
         <w:t>)</w:t>
       </w:r>
@@ -1837,188 +1268,135 @@
         <w:t>Code:</w:t>
       </w:r>
       <w:r>
+        <w:t xml:space="preserve"> System.out.println("</w:t>
+      </w:r>
+      <w:r>
+        <w:rPr>
+          <w:rFonts w:ascii="Segoe UI Emoji" w:hAnsi="Segoe UI Emoji" w:cs="Segoe UI Emoji"/>
+        </w:rPr>
+        <w:t>🏁</w:t>
+      </w:r>
+      <w:r>
+        <w:t xml:space="preserve"> " + winner.getName() + " wins the race!");</w:t>
+      </w:r>
+    </w:p>
+    <w:p/>
+    <w:p>
+      <w:r>
+        <w:t>There were also issues in printSeat(). If a typist’s progress went past the passage length, the spacing</w:t>
+      </w:r>
+      <w:r>
         <w:t xml:space="preserve"> </w:t>
       </w:r>
-      <w:proofErr w:type="spellStart"/>
-      <w:r>
-        <w:t>System.out.println</w:t>
-      </w:r>
-      <w:proofErr w:type="spellEnd"/>
-      <w:r>
-        <w:t>("</w:t>
-      </w:r>
-      <w:r>
-        <w:rPr>
-          <w:rFonts w:ascii="Segoe UI Emoji" w:hAnsi="Segoe UI Emoji" w:cs="Segoe UI Emoji"/>
-        </w:rPr>
-        <w:t>🏁</w:t>
-      </w:r>
-      <w:r>
-        <w:t xml:space="preserve"> " + </w:t>
-      </w:r>
-      <w:proofErr w:type="spellStart"/>
-      <w:proofErr w:type="gramStart"/>
-      <w:r>
-        <w:t>winner.getName</w:t>
-      </w:r>
-      <w:proofErr w:type="spellEnd"/>
-      <w:proofErr w:type="gramEnd"/>
-      <w:r>
-        <w:t>() + " wins the race!");</w:t>
+      <w:r>
+        <w:t xml:space="preserve">could become incorrect and affect the race </w:t>
+      </w:r>
+      <w:r>
+        <w:t>picture</w:t>
+      </w:r>
+      <w:r>
+        <w:t xml:space="preserve">. I fixed this by </w:t>
+      </w:r>
+      <w:r>
+        <w:t>keeping</w:t>
+      </w:r>
+      <w:r>
+        <w:t xml:space="preserve"> the displayed progress </w:t>
+      </w:r>
+      <w:r>
+        <w:t>as much as</w:t>
+      </w:r>
+      <w:r>
+        <w:t xml:space="preserve"> the passage length before calculating </w:t>
+      </w:r>
+      <w:r>
+        <w:t xml:space="preserve">the </w:t>
+      </w:r>
+      <w:r>
+        <w:t>spaces. The correct implementation should keep the visual output readable even if the progress overshoots.</w:t>
+      </w:r>
+    </w:p>
+    <w:p>
+      <w:r>
+        <w:t xml:space="preserve">Code: </w:t>
+      </w:r>
+      <w:r>
+        <w:t>if (progress &gt; passageLength) {</w:t>
+      </w:r>
+    </w:p>
+    <w:p>
+      <w:r>
+        <w:t>            progress = passageLength;</w:t>
+      </w:r>
+    </w:p>
+    <w:p>
+      <w:r>
+        <w:t>        }</w:t>
       </w:r>
     </w:p>
     <w:p/>
     <w:p>
       <w:r>
-        <w:t xml:space="preserve">There were also issues in </w:t>
-      </w:r>
-      <w:proofErr w:type="spellStart"/>
-      <w:proofErr w:type="gramStart"/>
-      <w:r>
-        <w:t>printSeat</w:t>
-      </w:r>
-      <w:proofErr w:type="spellEnd"/>
-      <w:r>
-        <w:t>(</w:t>
-      </w:r>
-      <w:proofErr w:type="gramEnd"/>
-      <w:r>
-        <w:t>). If a typist’s progress went past the passage length, the spacing</w:t>
+        <w:t>Finally, when a typist was burnt out, the extra ~ symbol could cause spacing issues. I adjusted the spacing so that it does not become negative. The correct implementation should show burnout clearly without breaking the formatting.</w:t>
+      </w:r>
+    </w:p>
+    <w:p>
+      <w:r>
+        <w:t xml:space="preserve">Code: </w:t>
+      </w:r>
+      <w:r>
+        <w:t>if (theTypist.isBurntOut()) {</w:t>
+      </w:r>
+    </w:p>
+    <w:p>
+      <w:r>
+        <w:t>            System.out.print('~');</w:t>
+      </w:r>
+    </w:p>
+    <w:p>
+      <w:r>
+        <w:t>            if (spacesAfter &gt; 0) {</w:t>
+      </w:r>
+    </w:p>
+    <w:p>
+      <w:r>
+        <w:t>                spacesAfter--; // ~ takes one character space</w:t>
+      </w:r>
+    </w:p>
+    <w:p>
+      <w:r>
+        <w:t>            }</w:t>
+      </w:r>
+    </w:p>
+    <w:p>
+      <w:r>
+        <w:t>        }</w:t>
+      </w:r>
+    </w:p>
+    <w:p>
+      <w:r>
+        <w:t xml:space="preserve">Optionally, </w:t>
+      </w:r>
+      <w:r>
+        <w:t xml:space="preserve">I added a small improvement to show when a typist has just mistyped. </w:t>
+      </w:r>
+      <w:r>
+        <w:t>I use a</w:t>
       </w:r>
       <w:r>
         <w:t xml:space="preserve"> </w:t>
       </w:r>
       <w:r>
-        <w:t xml:space="preserve">could become incorrect and affect the race </w:t>
-      </w:r>
-      <w:r>
-        <w:t>picture</w:t>
-      </w:r>
-      <w:r>
-        <w:t xml:space="preserve">. I fixed this by </w:t>
-      </w:r>
-      <w:r>
-        <w:t>keeping</w:t>
-      </w:r>
-      <w:r>
-        <w:t xml:space="preserve"> the displayed progress </w:t>
-      </w:r>
-      <w:r>
-        <w:t>as much as</w:t>
-      </w:r>
-      <w:r>
-        <w:t xml:space="preserve"> the passage length before calculating </w:t>
-      </w:r>
-      <w:r>
-        <w:t xml:space="preserve">the </w:t>
-      </w:r>
-      <w:r>
-        <w:t>spaces. The correct implementation should keep the visual output readable even if the progress overshoots.</w:t>
-      </w:r>
-    </w:p>
-    <w:p>
-      <w:r>
-        <w:t xml:space="preserve">Code: </w:t>
-      </w:r>
-      <w:r>
-        <w:t xml:space="preserve">if (progress &gt; </w:t>
-      </w:r>
-      <w:proofErr w:type="spellStart"/>
-      <w:r>
-        <w:t>passageLength</w:t>
-      </w:r>
-      <w:proofErr w:type="spellEnd"/>
-      <w:r>
-        <w:t>) {</w:t>
-      </w:r>
-    </w:p>
-    <w:p>
-      <w:r>
-        <w:t xml:space="preserve">            progress = </w:t>
-      </w:r>
-      <w:proofErr w:type="spellStart"/>
-      <w:r>
-        <w:t>passageLength</w:t>
-      </w:r>
-      <w:proofErr w:type="spellEnd"/>
-      <w:r>
-        <w:t>;</w:t>
-      </w:r>
-    </w:p>
-    <w:p>
-      <w:r>
-        <w:t>        }</w:t>
-      </w:r>
-    </w:p>
-    <w:p/>
-    <w:p>
-      <w:r>
-        <w:t>Finally, when a typist was burnt out, the extra ~ symbol could cause spacing issues. I adjusted the spacing so that it does not become negative. The correct implementation should show burnout clearly without breaking the formatting.</w:t>
-      </w:r>
-    </w:p>
-    <w:p>
-      <w:r>
-        <w:t xml:space="preserve">Code: </w:t>
-      </w:r>
-      <w:r>
-        <w:t>if (</w:t>
-      </w:r>
-      <w:proofErr w:type="spellStart"/>
-      <w:r>
-        <w:t>theTypist.isBurntOut</w:t>
-      </w:r>
-      <w:proofErr w:type="spellEnd"/>
-      <w:r>
-        <w:t>()) {</w:t>
-      </w:r>
-    </w:p>
-    <w:p>
-      <w:r>
-        <w:t xml:space="preserve">            </w:t>
-      </w:r>
-      <w:proofErr w:type="spellStart"/>
-      <w:r>
-        <w:t>System.out.print</w:t>
-      </w:r>
-      <w:proofErr w:type="spellEnd"/>
-      <w:r>
-        <w:t>('~');</w:t>
-      </w:r>
-    </w:p>
-    <w:p>
-      <w:r>
-        <w:t>            if (</w:t>
-      </w:r>
-      <w:proofErr w:type="spellStart"/>
-      <w:r>
-        <w:t>spacesAfter</w:t>
-      </w:r>
-      <w:proofErr w:type="spellEnd"/>
-      <w:r>
-        <w:t xml:space="preserve"> &gt; 0) {</w:t>
-      </w:r>
-    </w:p>
-    <w:p>
-      <w:r>
-        <w:t xml:space="preserve">                </w:t>
-      </w:r>
-      <w:proofErr w:type="spellStart"/>
-      <w:r>
-        <w:t>spacesAfter</w:t>
-      </w:r>
-      <w:proofErr w:type="spellEnd"/>
-      <w:r>
-        <w:t>--; // ~ takes one character space</w:t>
-      </w:r>
-    </w:p>
-    <w:p>
-      <w:r>
-        <w:t>            }</w:t>
-      </w:r>
-    </w:p>
-    <w:p>
-      <w:r>
-        <w:t>        }</w:t>
+        <w:t xml:space="preserve">temporary </w:t>
+      </w:r>
+      <w:r>
+        <w:t xml:space="preserve">flag in the Typist class, which is set when slideBack() is called and cleared after being displayed. The typist is shown with a &lt; symbol for one turn, making the race output </w:t>
+      </w:r>
+      <w:r>
+        <w:t>clearer</w:t>
+      </w:r>
+      <w:r>
+        <w:t>.</w:t>
       </w:r>
     </w:p>
     <w:p/>

</xml_diff>